<commit_message>
Update repo with final db doc
</commit_message>
<xml_diff>
--- a/mom/CSCI-Y_Documentation.docx
+++ b/mom/CSCI-Y_Documentation.docx
@@ -6,8 +6,8 @@
       <w:pPr>
         <w:jc w:val="center"/>
         <w:rPr>
-          <w:sz w:val="50"/>
-          <w:szCs w:val="50"/>
+          <w:sz w:val="28"/>
+          <w:szCs w:val="28"/>
         </w:rPr>
       </w:pPr>
       <w:r>
@@ -658,7 +658,6 @@
           <w:sz w:val="20"/>
           <w:szCs w:val="20"/>
         </w:rPr>
-        <w:lastRenderedPageBreak/>
         <w:t>Chunking and semantic retrieval understanding:</w:t>
       </w:r>
       <w:r>
@@ -691,6 +690,7 @@
           <w:sz w:val="20"/>
           <w:szCs w:val="20"/>
         </w:rPr>
+        <w:lastRenderedPageBreak/>
         <w:t>Instrumentation, robustness, and cleanup mechanisms:</w:t>
       </w:r>
       <w:r>
@@ -965,17 +965,6 @@
         <w:ind w:left="360"/>
         <w:rPr>
           <w:rFonts w:asciiTheme="minorHAnsi" w:hAnsiTheme="minorHAnsi"/>
-          <w:sz w:val="20"/>
-          <w:szCs w:val="20"/>
-        </w:rPr>
-      </w:pPr>
-    </w:p>
-    <w:p>
-      <w:pPr>
-        <w:pStyle w:val="NormalWeb"/>
-        <w:ind w:left="360"/>
-        <w:rPr>
-          <w:rFonts w:asciiTheme="minorHAnsi" w:hAnsiTheme="minorHAnsi"/>
         </w:rPr>
       </w:pPr>
       <w:r>
@@ -986,7 +975,7 @@
         </w:rPr>
         <w:t xml:space="preserve">Hugging face link: </w:t>
       </w:r>
-      <w:hyperlink r:id="rId5" w:history="1">
+      <w:hyperlink r:id="rId7" w:history="1">
         <w:r>
           <w:rPr>
             <w:rStyle w:val="Hyperlink"/>
@@ -1006,7 +995,7 @@
         <w:br/>
         <w:t xml:space="preserve">Queries dataset: </w:t>
       </w:r>
-      <w:hyperlink r:id="rId6" w:history="1">
+      <w:hyperlink r:id="rId8" w:history="1">
         <w:r>
           <w:rPr>
             <w:rStyle w:val="Hyperlink"/>
@@ -1246,16 +1235,7 @@
           <w:sz w:val="20"/>
           <w:szCs w:val="20"/>
         </w:rPr>
-        <w:t xml:space="preserve"> does not accept raw dictionaries for point </w:t>
-      </w:r>
-      <w:r>
-        <w:rPr>
-          <w:rFonts w:asciiTheme="minorHAnsi" w:hAnsiTheme="minorHAnsi"/>
-          <w:sz w:val="20"/>
-          <w:szCs w:val="20"/>
-        </w:rPr>
-        <w:lastRenderedPageBreak/>
-        <w:t xml:space="preserve">insertion. This was resolved by switching to </w:t>
+        <w:t xml:space="preserve"> does not accept raw dictionaries for point insertion. This was resolved by switching to </w:t>
       </w:r>
       <w:proofErr w:type="spellStart"/>
       <w:r>
@@ -1954,7 +1934,6 @@
           <w:sz w:val="20"/>
           <w:szCs w:val="20"/>
         </w:rPr>
-        <w:lastRenderedPageBreak/>
         <w:t>Environment Fixes and Python Compatibility Issues</w:t>
       </w:r>
       <w:r>
@@ -2191,6 +2170,7 @@
           <w:sz w:val="20"/>
           <w:szCs w:val="20"/>
         </w:rPr>
+        <w:lastRenderedPageBreak/>
         <w:t>Documentation, Benchmark Direction &amp; PPT Preparation</w:t>
       </w:r>
       <w:r>
@@ -2271,7 +2251,7 @@
         </w:rPr>
         <w:t xml:space="preserve">: </w:t>
       </w:r>
-      <w:hyperlink r:id="rId7" w:history="1">
+      <w:hyperlink r:id="rId9" w:history="1">
         <w:r>
           <w:rPr>
             <w:rStyle w:val="Hyperlink"/>
@@ -2455,7 +2435,7 @@
         </w:rPr>
         <w:t xml:space="preserve">Image WIT dataset: </w:t>
       </w:r>
-      <w:hyperlink r:id="rId8" w:history="1">
+      <w:hyperlink r:id="rId10" w:history="1">
         <w:r>
           <w:rPr>
             <w:rStyle w:val="Hyperlink"/>
@@ -2524,15 +2504,7 @@
           <w:szCs w:val="20"/>
         </w:rPr>
         <w:br/>
-        <w:t xml:space="preserve">While loading the WIT dataset, a disk space error occurred because the full dataset is extremely large. This was resolved by switching to streaming mode and sampling only a subset. There were </w:t>
-      </w:r>
-      <w:r>
-        <w:rPr>
-          <w:sz w:val="20"/>
-          <w:szCs w:val="20"/>
-        </w:rPr>
-        <w:lastRenderedPageBreak/>
-        <w:t xml:space="preserve">also 403 errors when downloading images from Wikimedia, which were handled by adjusting request handling and filtering valid entries. </w:t>
+        <w:t xml:space="preserve">While loading the WIT dataset, a disk space error occurred because the full dataset is extremely large. This was resolved by switching to streaming mode and sampling only a subset. There were also 403 errors when downloading images from Wikimedia, which were handled by adjusting request handling and filtering valid entries. </w:t>
       </w:r>
     </w:p>
     <w:p>
@@ -2718,7 +2690,15 @@
           <w:szCs w:val="20"/>
         </w:rPr>
         <w:br/>
-        <w:t>A PowerPoint was prepared outlining completed components and planned extensions such as scaling experiments and advanced indexing. The PPT clearly separates “Done” and “To Be Done,” explaining the multimodal extension, CLIP integration, and benchmarking direction. This supports formal documentation for research presentation and progress tracking.</w:t>
+        <w:t xml:space="preserve">A PowerPoint was prepared outlining completed components and planned extensions such as scaling experiments and advanced indexing. The PPT clearly separates “Done” and “To Be Done,” </w:t>
+      </w:r>
+      <w:r>
+        <w:rPr>
+          <w:sz w:val="20"/>
+          <w:szCs w:val="20"/>
+        </w:rPr>
+        <w:lastRenderedPageBreak/>
+        <w:t>explaining the multimodal extension, CLIP integration, and benchmarking direction. This supports formal documentation for research presentation and progress tracking.</w:t>
       </w:r>
     </w:p>
     <w:p>
@@ -3056,7 +3036,6 @@
           <w:sz w:val="20"/>
           <w:szCs w:val="20"/>
         </w:rPr>
-        <w:lastRenderedPageBreak/>
         <w:t>Initial Milvus connection error and diagnosis</w:t>
       </w:r>
       <w:r>
@@ -3219,7 +3198,15 @@
           <w:szCs w:val="20"/>
         </w:rPr>
         <w:br/>
-        <w:t xml:space="preserve">The main pipeline was updated to allow dynamic selection of index types during runtime. Proper handling was added to reset or isolate collections between runs to avoid contamination of results. This enabled structured comparison of different indexing strategies within Milvus as part of the benchmarking workflow. </w:t>
+        <w:t xml:space="preserve">The main pipeline was updated to allow dynamic selection of index types during runtime. Proper handling was added to reset or isolate collections between runs to avoid contamination of </w:t>
+      </w:r>
+      <w:r>
+        <w:rPr>
+          <w:sz w:val="20"/>
+          <w:szCs w:val="20"/>
+        </w:rPr>
+        <w:lastRenderedPageBreak/>
+        <w:t xml:space="preserve">results. This enabled structured comparison of different indexing strategies within Milvus as part of the benchmarking workflow. </w:t>
       </w:r>
     </w:p>
     <w:p>
@@ -3560,7 +3547,6 @@
           <w:sz w:val="26"/>
           <w:szCs w:val="26"/>
         </w:rPr>
-        <w:lastRenderedPageBreak/>
         <w:br/>
       </w:r>
     </w:p>
@@ -3581,17 +3567,1751 @@
           <w:sz w:val="26"/>
           <w:szCs w:val="26"/>
         </w:rPr>
-        <w:t>(22-26 March)</w:t>
-      </w:r>
+        <w:t xml:space="preserve">Recall </w:t>
+      </w:r>
+      <w:r>
+        <w:rPr>
+          <w:sz w:val="26"/>
+          <w:szCs w:val="26"/>
+        </w:rPr>
+        <w:t>(22-2</w:t>
+      </w:r>
+      <w:r>
+        <w:rPr>
+          <w:sz w:val="26"/>
+          <w:szCs w:val="26"/>
+        </w:rPr>
+        <w:t>8</w:t>
+      </w:r>
+      <w:r>
+        <w:rPr>
+          <w:sz w:val="26"/>
+          <w:szCs w:val="26"/>
+        </w:rPr>
+        <w:t xml:space="preserve"> March</w:t>
+      </w:r>
+      <w:r>
+        <w:rPr>
+          <w:sz w:val="26"/>
+          <w:szCs w:val="26"/>
+        </w:rPr>
+        <w:t>)</w:t>
+      </w:r>
+    </w:p>
+    <w:p>
+      <w:pPr>
+        <w:pStyle w:val="ListParagraph"/>
+        <w:numPr>
+          <w:ilvl w:val="1"/>
+          <w:numId w:val="40"/>
+        </w:numPr>
+        <w:spacing w:after="0"/>
+        <w:rPr>
+          <w:sz w:val="20"/>
+          <w:szCs w:val="20"/>
+        </w:rPr>
+      </w:pPr>
+      <w:r>
+        <w:rPr>
+          <w:b/>
+          <w:bCs/>
+          <w:sz w:val="20"/>
+          <w:szCs w:val="20"/>
+        </w:rPr>
+        <w:t>Dataset extraction issues and debugging</w:t>
+      </w:r>
+      <w:r>
+        <w:rPr>
+          <w:sz w:val="20"/>
+          <w:szCs w:val="20"/>
+        </w:rPr>
+        <w:br/>
+        <w:t xml:space="preserve">Initially tried using Natural Questions to generate query–answer pairs, but answers appeared blank due to incorrect field usage. Realized that the dataset stores answers in a nested format (short/long spans), which required additional parsing and token joining. Fixed errors like list-to-string conversion and corrected extraction logic. </w:t>
+      </w:r>
+    </w:p>
+    <w:p>
+      <w:pPr>
+        <w:pStyle w:val="ListParagraph"/>
+        <w:numPr>
+          <w:ilvl w:val="1"/>
+          <w:numId w:val="40"/>
+        </w:numPr>
+        <w:spacing w:after="0"/>
+        <w:rPr>
+          <w:sz w:val="20"/>
+          <w:szCs w:val="20"/>
+        </w:rPr>
+      </w:pPr>
+      <w:r>
+        <w:rPr>
+          <w:b/>
+          <w:bCs/>
+          <w:sz w:val="20"/>
+          <w:szCs w:val="20"/>
+        </w:rPr>
+        <w:t>Handling API and dataset limitations</w:t>
+      </w:r>
+      <w:r>
+        <w:rPr>
+          <w:sz w:val="20"/>
+          <w:szCs w:val="20"/>
+        </w:rPr>
+        <w:br/>
+        <w:t xml:space="preserve">Encountered rate limiting errors while streaming the dataset from Hugging Face, which required authentication using a token. Also identified that Natural Questions is not clean for direct use due to missing or inconsistent answers, making it harder for evaluation. </w:t>
+      </w:r>
+    </w:p>
+    <w:p>
+      <w:pPr>
+        <w:pStyle w:val="ListParagraph"/>
+        <w:numPr>
+          <w:ilvl w:val="1"/>
+          <w:numId w:val="40"/>
+        </w:numPr>
+        <w:spacing w:after="0"/>
+        <w:rPr>
+          <w:sz w:val="20"/>
+          <w:szCs w:val="20"/>
+        </w:rPr>
+      </w:pPr>
+      <w:r>
+        <w:rPr>
+          <w:b/>
+          <w:bCs/>
+          <w:sz w:val="20"/>
+          <w:szCs w:val="20"/>
+        </w:rPr>
+        <w:t>Dataset design decision</w:t>
+      </w:r>
+      <w:r>
+        <w:rPr>
+          <w:sz w:val="20"/>
+          <w:szCs w:val="20"/>
+        </w:rPr>
+        <w:br/>
+        <w:t xml:space="preserve">Evaluated the complexity of Natural Questions and decided that cleaner datasets like </w:t>
+      </w:r>
+      <w:proofErr w:type="spellStart"/>
+      <w:r>
+        <w:rPr>
+          <w:sz w:val="20"/>
+          <w:szCs w:val="20"/>
+        </w:rPr>
+        <w:t>SQuAD</w:t>
+      </w:r>
+      <w:proofErr w:type="spellEnd"/>
+      <w:r>
+        <w:rPr>
+          <w:sz w:val="20"/>
+          <w:szCs w:val="20"/>
+        </w:rPr>
+        <w:t xml:space="preserve"> are better suited for recall evaluation. This decision was based on the need for consistent query–answer pairs and easier comparison during benchmarking. Natural Questions was still explored to understand real-world dataset challenges. </w:t>
+      </w:r>
+    </w:p>
+    <w:p>
+      <w:pPr>
+        <w:pStyle w:val="ListParagraph"/>
+        <w:numPr>
+          <w:ilvl w:val="1"/>
+          <w:numId w:val="40"/>
+        </w:numPr>
+        <w:spacing w:after="0"/>
+        <w:rPr>
+          <w:sz w:val="20"/>
+          <w:szCs w:val="20"/>
+        </w:rPr>
+      </w:pPr>
+      <w:r>
+        <w:rPr>
+          <w:b/>
+          <w:bCs/>
+          <w:sz w:val="20"/>
+          <w:szCs w:val="20"/>
+        </w:rPr>
+        <w:t>Recall module design and integration</w:t>
+      </w:r>
+      <w:r>
+        <w:rPr>
+          <w:sz w:val="20"/>
+          <w:szCs w:val="20"/>
+        </w:rPr>
+        <w:br/>
+        <w:t xml:space="preserve">Designed a recall evaluation step to be added after </w:t>
+      </w:r>
+      <w:proofErr w:type="gramStart"/>
+      <w:r>
+        <w:rPr>
+          <w:sz w:val="20"/>
+          <w:szCs w:val="20"/>
+        </w:rPr>
+        <w:t>Top-K</w:t>
+      </w:r>
+      <w:proofErr w:type="gramEnd"/>
+      <w:r>
+        <w:rPr>
+          <w:sz w:val="20"/>
+          <w:szCs w:val="20"/>
+        </w:rPr>
+        <w:t xml:space="preserve"> retrieval in the pipeline. Chose to use CLIP embeddings with cosine similarity to measure relevance, ensuring consistency with the </w:t>
+      </w:r>
+      <w:r>
+        <w:rPr>
+          <w:sz w:val="20"/>
+          <w:szCs w:val="20"/>
+        </w:rPr>
+        <w:lastRenderedPageBreak/>
+        <w:t xml:space="preserve">retrieval space and avoiding additional model overhead like BERT. Defined </w:t>
+      </w:r>
+      <w:proofErr w:type="spellStart"/>
+      <w:r>
+        <w:rPr>
+          <w:sz w:val="20"/>
+          <w:szCs w:val="20"/>
+        </w:rPr>
+        <w:t>Recall@K</w:t>
+      </w:r>
+      <w:proofErr w:type="spellEnd"/>
+      <w:r>
+        <w:rPr>
+          <w:sz w:val="20"/>
+          <w:szCs w:val="20"/>
+        </w:rPr>
+        <w:t xml:space="preserve"> as the primary metric for evaluating retrieval correctness. </w:t>
+      </w:r>
+    </w:p>
+    <w:p>
+      <w:pPr>
+        <w:pStyle w:val="ListParagraph"/>
+        <w:numPr>
+          <w:ilvl w:val="1"/>
+          <w:numId w:val="40"/>
+        </w:numPr>
+        <w:rPr>
+          <w:sz w:val="20"/>
+          <w:szCs w:val="20"/>
+        </w:rPr>
+      </w:pPr>
+      <w:r>
+        <w:rPr>
+          <w:b/>
+          <w:bCs/>
+          <w:sz w:val="20"/>
+          <w:szCs w:val="20"/>
+        </w:rPr>
+        <w:t>Documentation and presentation preparation</w:t>
+      </w:r>
+      <w:r>
+        <w:rPr>
+          <w:sz w:val="20"/>
+          <w:szCs w:val="20"/>
+        </w:rPr>
+        <w:br/>
+        <w:t>Created a flowchart representing the updated multimodal pipeline with the recall module included. Prepared PPT content explaining the design rationale, similarity calculation, and evaluation approach. The slide highlights both completed work and planned extensions for future improvements</w:t>
+      </w:r>
+      <w:r>
+        <w:rPr>
+          <w:sz w:val="20"/>
+          <w:szCs w:val="20"/>
+        </w:rPr>
+        <w:t>.</w:t>
+      </w:r>
+    </w:p>
+    <w:p>
+      <w:pPr>
+        <w:pStyle w:val="ListParagraph"/>
+        <w:ind w:left="360"/>
+        <w:rPr>
+          <w:sz w:val="26"/>
+          <w:szCs w:val="26"/>
+        </w:rPr>
+      </w:pPr>
+    </w:p>
+    <w:p>
+      <w:pPr>
+        <w:pStyle w:val="ListParagraph"/>
+        <w:numPr>
+          <w:ilvl w:val="0"/>
+          <w:numId w:val="24"/>
+        </w:numPr>
+        <w:rPr>
+          <w:sz w:val="26"/>
+          <w:szCs w:val="26"/>
+        </w:rPr>
+      </w:pPr>
+      <w:r>
+        <w:rPr>
+          <w:sz w:val="26"/>
+          <w:szCs w:val="26"/>
+        </w:rPr>
+        <w:t xml:space="preserve">New PC Allocated </w:t>
+      </w:r>
+      <w:r>
+        <w:rPr>
+          <w:sz w:val="26"/>
+          <w:szCs w:val="26"/>
+        </w:rPr>
+        <w:t>(29 March – 4 April)</w:t>
+      </w:r>
+    </w:p>
+    <w:p>
+      <w:pPr>
+        <w:pStyle w:val="ListParagraph"/>
+        <w:numPr>
+          <w:ilvl w:val="1"/>
+          <w:numId w:val="44"/>
+        </w:numPr>
+        <w:spacing w:after="0" w:line="240" w:lineRule="auto"/>
+        <w:ind w:left="709"/>
+        <w:rPr>
+          <w:rFonts w:eastAsia="Times New Roman" w:cs="Times New Roman"/>
+          <w:kern w:val="0"/>
+          <w:sz w:val="20"/>
+          <w:szCs w:val="20"/>
+          <w:lang w:eastAsia="en-IN"/>
+          <w14:ligatures w14:val="none"/>
+        </w:rPr>
+      </w:pPr>
+      <w:r>
+        <w:rPr>
+          <w:rFonts w:eastAsia="Times New Roman" w:cs="Times New Roman"/>
+          <w:b/>
+          <w:bCs/>
+          <w:kern w:val="0"/>
+          <w:sz w:val="20"/>
+          <w:szCs w:val="20"/>
+          <w:lang w:eastAsia="en-IN"/>
+          <w14:ligatures w14:val="none"/>
+        </w:rPr>
+        <w:t>Initial setup and RED issues:</w:t>
+      </w:r>
+      <w:r>
+        <w:rPr>
+          <w:rFonts w:eastAsia="Times New Roman" w:cs="Times New Roman"/>
+          <w:kern w:val="0"/>
+          <w:sz w:val="20"/>
+          <w:szCs w:val="20"/>
+          <w:lang w:eastAsia="en-IN"/>
+          <w14:ligatures w14:val="none"/>
+        </w:rPr>
+        <w:br/>
+        <w:t xml:space="preserve">While setting up Milvus on RED using </w:t>
+      </w:r>
+      <w:proofErr w:type="spellStart"/>
+      <w:r>
+        <w:rPr>
+          <w:rFonts w:eastAsia="Times New Roman" w:cs="Times New Roman"/>
+          <w:kern w:val="0"/>
+          <w:sz w:val="20"/>
+          <w:szCs w:val="20"/>
+          <w:lang w:eastAsia="en-IN"/>
+          <w14:ligatures w14:val="none"/>
+        </w:rPr>
+        <w:t>Apptainer</w:t>
+      </w:r>
+      <w:proofErr w:type="spellEnd"/>
+      <w:r>
+        <w:rPr>
+          <w:rFonts w:eastAsia="Times New Roman" w:cs="Times New Roman"/>
+          <w:kern w:val="0"/>
+          <w:sz w:val="20"/>
+          <w:szCs w:val="20"/>
+          <w:lang w:eastAsia="en-IN"/>
+          <w14:ligatures w14:val="none"/>
+        </w:rPr>
+        <w:t xml:space="preserve">, a persistent port conflict issue (port 19530) was encountered. Multiple debugging steps were tried including checking ports using </w:t>
+      </w:r>
+      <w:proofErr w:type="spellStart"/>
+      <w:r>
+        <w:rPr>
+          <w:rFonts w:eastAsia="Times New Roman" w:cs="Courier New"/>
+          <w:kern w:val="0"/>
+          <w:sz w:val="20"/>
+          <w:szCs w:val="20"/>
+          <w:lang w:eastAsia="en-IN"/>
+          <w14:ligatures w14:val="none"/>
+        </w:rPr>
+        <w:t>lsof</w:t>
+      </w:r>
+      <w:proofErr w:type="spellEnd"/>
+      <w:r>
+        <w:rPr>
+          <w:rFonts w:eastAsia="Times New Roman" w:cs="Times New Roman"/>
+          <w:kern w:val="0"/>
+          <w:sz w:val="20"/>
+          <w:szCs w:val="20"/>
+          <w:lang w:eastAsia="en-IN"/>
+          <w14:ligatures w14:val="none"/>
+        </w:rPr>
+        <w:t xml:space="preserve">, </w:t>
+      </w:r>
+      <w:r>
+        <w:rPr>
+          <w:rFonts w:eastAsia="Times New Roman" w:cs="Courier New"/>
+          <w:kern w:val="0"/>
+          <w:sz w:val="20"/>
+          <w:szCs w:val="20"/>
+          <w:lang w:eastAsia="en-IN"/>
+          <w14:ligatures w14:val="none"/>
+        </w:rPr>
+        <w:t>ss</w:t>
+      </w:r>
+      <w:r>
+        <w:rPr>
+          <w:rFonts w:eastAsia="Times New Roman" w:cs="Times New Roman"/>
+          <w:kern w:val="0"/>
+          <w:sz w:val="20"/>
+          <w:szCs w:val="20"/>
+          <w:lang w:eastAsia="en-IN"/>
+          <w14:ligatures w14:val="none"/>
+        </w:rPr>
+        <w:t xml:space="preserve">, and </w:t>
+      </w:r>
+      <w:r>
+        <w:rPr>
+          <w:rFonts w:eastAsia="Times New Roman" w:cs="Courier New"/>
+          <w:kern w:val="0"/>
+          <w:sz w:val="20"/>
+          <w:szCs w:val="20"/>
+          <w:lang w:eastAsia="en-IN"/>
+          <w14:ligatures w14:val="none"/>
+        </w:rPr>
+        <w:t>netstat</w:t>
+      </w:r>
+      <w:r>
+        <w:rPr>
+          <w:rFonts w:eastAsia="Times New Roman" w:cs="Times New Roman"/>
+          <w:kern w:val="0"/>
+          <w:sz w:val="20"/>
+          <w:szCs w:val="20"/>
+          <w:lang w:eastAsia="en-IN"/>
+          <w14:ligatures w14:val="none"/>
+        </w:rPr>
+        <w:t xml:space="preserve">, and attempting to kill processes, but no visible process was found using the port. It was suspected that a system-level process might be occupying the port, which could not be accessed or modified. </w:t>
+      </w:r>
+    </w:p>
+    <w:p>
+      <w:pPr>
+        <w:pStyle w:val="ListParagraph"/>
+        <w:numPr>
+          <w:ilvl w:val="1"/>
+          <w:numId w:val="44"/>
+        </w:numPr>
+        <w:spacing w:after="0" w:line="240" w:lineRule="auto"/>
+        <w:ind w:left="709"/>
+        <w:rPr>
+          <w:rFonts w:eastAsia="Times New Roman" w:cs="Times New Roman"/>
+          <w:kern w:val="0"/>
+          <w:sz w:val="20"/>
+          <w:szCs w:val="20"/>
+          <w:lang w:eastAsia="en-IN"/>
+          <w14:ligatures w14:val="none"/>
+        </w:rPr>
+      </w:pPr>
+      <w:r>
+        <w:rPr>
+          <w:rFonts w:eastAsia="Times New Roman" w:cs="Times New Roman"/>
+          <w:b/>
+          <w:bCs/>
+          <w:kern w:val="0"/>
+          <w:sz w:val="20"/>
+          <w:szCs w:val="20"/>
+          <w:lang w:eastAsia="en-IN"/>
+          <w14:ligatures w14:val="none"/>
+        </w:rPr>
+        <w:t>Attempts to resolve with support and research:</w:t>
+      </w:r>
+      <w:r>
+        <w:rPr>
+          <w:rFonts w:eastAsia="Times New Roman" w:cs="Times New Roman"/>
+          <w:kern w:val="0"/>
+          <w:sz w:val="20"/>
+          <w:szCs w:val="20"/>
+          <w:lang w:eastAsia="en-IN"/>
+          <w14:ligatures w14:val="none"/>
+        </w:rPr>
+        <w:br/>
+        <w:t xml:space="preserve">The issue was discussed with the UITS and RED support teams, and relevant forums and documentation were explored. Although similar issues were found, no clear or working solution was identified, and upgrading Milvus versions also did not resolve the problem. Suggestions like adding port checks were implemented, but they only confirmed the port was still occupied without helping to free it. </w:t>
+      </w:r>
+    </w:p>
+    <w:p>
+      <w:pPr>
+        <w:pStyle w:val="ListParagraph"/>
+        <w:numPr>
+          <w:ilvl w:val="1"/>
+          <w:numId w:val="44"/>
+        </w:numPr>
+        <w:spacing w:after="0" w:line="240" w:lineRule="auto"/>
+        <w:ind w:left="709"/>
+        <w:rPr>
+          <w:rFonts w:eastAsia="Times New Roman" w:cs="Times New Roman"/>
+          <w:kern w:val="0"/>
+          <w:sz w:val="20"/>
+          <w:szCs w:val="20"/>
+          <w:lang w:eastAsia="en-IN"/>
+          <w14:ligatures w14:val="none"/>
+        </w:rPr>
+      </w:pPr>
+      <w:r>
+        <w:rPr>
+          <w:rFonts w:eastAsia="Times New Roman" w:cs="Times New Roman"/>
+          <w:b/>
+          <w:bCs/>
+          <w:kern w:val="0"/>
+          <w:sz w:val="20"/>
+          <w:szCs w:val="20"/>
+          <w:lang w:eastAsia="en-IN"/>
+          <w14:ligatures w14:val="none"/>
+        </w:rPr>
+        <w:t>Decision to move to a dedicated system:</w:t>
+      </w:r>
+      <w:r>
+        <w:rPr>
+          <w:rFonts w:eastAsia="Times New Roman" w:cs="Times New Roman"/>
+          <w:kern w:val="0"/>
+          <w:sz w:val="20"/>
+          <w:szCs w:val="20"/>
+          <w:lang w:eastAsia="en-IN"/>
+          <w14:ligatures w14:val="none"/>
+        </w:rPr>
+        <w:br/>
+        <w:t xml:space="preserve">Based on the limitations of RED and lack of control over ports and services, it was concluded that a dedicated Linux system with admin access would be more suitable. A request was made to the professor for a system allocation, along with basic requirements for memory and storage. In parallel, communication with support teams continued while waiting for allocation. </w:t>
+      </w:r>
+    </w:p>
+    <w:p>
+      <w:pPr>
+        <w:pStyle w:val="ListParagraph"/>
+        <w:numPr>
+          <w:ilvl w:val="1"/>
+          <w:numId w:val="44"/>
+        </w:numPr>
+        <w:spacing w:after="0" w:line="240" w:lineRule="auto"/>
+        <w:ind w:left="709"/>
+        <w:rPr>
+          <w:rFonts w:eastAsia="Times New Roman" w:cs="Times New Roman"/>
+          <w:kern w:val="0"/>
+          <w:sz w:val="20"/>
+          <w:szCs w:val="20"/>
+          <w:lang w:eastAsia="en-IN"/>
+          <w14:ligatures w14:val="none"/>
+        </w:rPr>
+      </w:pPr>
+      <w:r>
+        <w:rPr>
+          <w:rFonts w:eastAsia="Times New Roman" w:cs="Times New Roman"/>
+          <w:b/>
+          <w:bCs/>
+          <w:kern w:val="0"/>
+          <w:sz w:val="20"/>
+          <w:szCs w:val="20"/>
+          <w:lang w:eastAsia="en-IN"/>
+          <w14:ligatures w14:val="none"/>
+        </w:rPr>
+        <w:t>New system setup and environment configuration:</w:t>
+      </w:r>
+      <w:r>
+        <w:rPr>
+          <w:rFonts w:eastAsia="Times New Roman" w:cs="Times New Roman"/>
+          <w:kern w:val="0"/>
+          <w:sz w:val="20"/>
+          <w:szCs w:val="20"/>
+          <w:lang w:eastAsia="en-IN"/>
+          <w14:ligatures w14:val="none"/>
+        </w:rPr>
+        <w:br/>
+        <w:t xml:space="preserve">A new workstation (buffalo) was allocated with Docker support and additional storage. SSH access was configured using a jump host (silo), and efforts were made to enable </w:t>
+      </w:r>
+      <w:proofErr w:type="spellStart"/>
+      <w:r>
+        <w:rPr>
+          <w:rFonts w:eastAsia="Times New Roman" w:cs="Times New Roman"/>
+          <w:kern w:val="0"/>
+          <w:sz w:val="20"/>
+          <w:szCs w:val="20"/>
+          <w:lang w:eastAsia="en-IN"/>
+          <w14:ligatures w14:val="none"/>
+        </w:rPr>
+        <w:t>passwordless</w:t>
+      </w:r>
+      <w:proofErr w:type="spellEnd"/>
+      <w:r>
+        <w:rPr>
+          <w:rFonts w:eastAsia="Times New Roman" w:cs="Times New Roman"/>
+          <w:kern w:val="0"/>
+          <w:sz w:val="20"/>
+          <w:szCs w:val="20"/>
+          <w:lang w:eastAsia="en-IN"/>
+          <w14:ligatures w14:val="none"/>
+        </w:rPr>
+        <w:t xml:space="preserve"> login using SSH keys. Issues like repeated authentication and VS Code connection errors were debugged and resolved by simplifying SSH config and fixing MAC/cipher mismatches. </w:t>
+      </w:r>
+    </w:p>
+    <w:p>
+      <w:pPr>
+        <w:pStyle w:val="ListParagraph"/>
+        <w:numPr>
+          <w:ilvl w:val="1"/>
+          <w:numId w:val="44"/>
+        </w:numPr>
+        <w:ind w:left="709"/>
+        <w:rPr>
+          <w:rFonts w:eastAsia="Times New Roman" w:cs="Times New Roman"/>
+          <w:kern w:val="0"/>
+          <w:sz w:val="20"/>
+          <w:szCs w:val="20"/>
+          <w:lang w:eastAsia="en-IN"/>
+          <w14:ligatures w14:val="none"/>
+        </w:rPr>
+      </w:pPr>
+      <w:r>
+        <w:rPr>
+          <w:rFonts w:eastAsia="Times New Roman" w:cs="Times New Roman"/>
+          <w:b/>
+          <w:bCs/>
+          <w:kern w:val="0"/>
+          <w:sz w:val="20"/>
+          <w:szCs w:val="20"/>
+          <w:lang w:eastAsia="en-IN"/>
+          <w14:ligatures w14:val="none"/>
+        </w:rPr>
+        <w:t>Project setup and dependency resolution:</w:t>
+      </w:r>
+      <w:r>
+        <w:rPr>
+          <w:rFonts w:eastAsia="Times New Roman" w:cs="Times New Roman"/>
+          <w:kern w:val="0"/>
+          <w:sz w:val="20"/>
+          <w:szCs w:val="20"/>
+          <w:lang w:eastAsia="en-IN"/>
+          <w14:ligatures w14:val="none"/>
+        </w:rPr>
+        <w:br/>
+        <w:t xml:space="preserve">The project repository was </w:t>
+      </w:r>
+      <w:proofErr w:type="gramStart"/>
+      <w:r>
+        <w:rPr>
+          <w:rFonts w:eastAsia="Times New Roman" w:cs="Times New Roman"/>
+          <w:kern w:val="0"/>
+          <w:sz w:val="20"/>
+          <w:szCs w:val="20"/>
+          <w:lang w:eastAsia="en-IN"/>
+          <w14:ligatures w14:val="none"/>
+        </w:rPr>
+        <w:t>cloned</w:t>
+      </w:r>
+      <w:proofErr w:type="gramEnd"/>
+      <w:r>
+        <w:rPr>
+          <w:rFonts w:eastAsia="Times New Roman" w:cs="Times New Roman"/>
+          <w:kern w:val="0"/>
+          <w:sz w:val="20"/>
+          <w:szCs w:val="20"/>
+          <w:lang w:eastAsia="en-IN"/>
+          <w14:ligatures w14:val="none"/>
+        </w:rPr>
+        <w:t xml:space="preserve"> and environment setup was initiated using Python virtual environments. Several dependency conflicts were encountered during installation (e.g., </w:t>
+      </w:r>
+      <w:proofErr w:type="spellStart"/>
+      <w:r>
+        <w:rPr>
+          <w:rFonts w:eastAsia="Times New Roman" w:cs="Times New Roman"/>
+          <w:kern w:val="0"/>
+          <w:sz w:val="20"/>
+          <w:szCs w:val="20"/>
+          <w:lang w:eastAsia="en-IN"/>
+          <w14:ligatures w14:val="none"/>
+        </w:rPr>
+        <w:t>protobuf</w:t>
+      </w:r>
+      <w:proofErr w:type="spellEnd"/>
+      <w:r>
+        <w:rPr>
+          <w:rFonts w:eastAsia="Times New Roman" w:cs="Times New Roman"/>
+          <w:kern w:val="0"/>
+          <w:sz w:val="20"/>
+          <w:szCs w:val="20"/>
+          <w:lang w:eastAsia="en-IN"/>
+          <w14:ligatures w14:val="none"/>
+        </w:rPr>
+        <w:t xml:space="preserve"> and transformers), which were resolved by relaxing version constraints and removing unnecessary packages. A PPT was also prepared to present work completed so far and outline next steps, including system setup and benchmarking plans.</w:t>
+      </w:r>
+    </w:p>
+    <w:p>
+      <w:pPr>
+        <w:pStyle w:val="ListParagraph"/>
+        <w:ind w:left="360"/>
+        <w:rPr>
+          <w:sz w:val="26"/>
+          <w:szCs w:val="26"/>
+        </w:rPr>
+      </w:pPr>
+    </w:p>
+    <w:p>
+      <w:pPr>
+        <w:pStyle w:val="ListParagraph"/>
+        <w:numPr>
+          <w:ilvl w:val="0"/>
+          <w:numId w:val="24"/>
+        </w:numPr>
+        <w:rPr>
+          <w:sz w:val="26"/>
+          <w:szCs w:val="26"/>
+        </w:rPr>
+      </w:pPr>
+      <w:proofErr w:type="spellStart"/>
+      <w:r>
+        <w:rPr>
+          <w:sz w:val="26"/>
+          <w:szCs w:val="26"/>
+        </w:rPr>
+        <w:t>Duckdb</w:t>
+      </w:r>
+      <w:proofErr w:type="spellEnd"/>
+      <w:r>
+        <w:rPr>
+          <w:sz w:val="26"/>
+          <w:szCs w:val="26"/>
+        </w:rPr>
+        <w:t xml:space="preserve"> and RAG </w:t>
+      </w:r>
+      <w:r>
+        <w:rPr>
+          <w:sz w:val="26"/>
+          <w:szCs w:val="26"/>
+        </w:rPr>
+        <w:t>(5 -11 April)</w:t>
+      </w:r>
+    </w:p>
+    <w:p>
+      <w:pPr>
+        <w:pStyle w:val="ListParagraph"/>
+        <w:numPr>
+          <w:ilvl w:val="1"/>
+          <w:numId w:val="47"/>
+        </w:numPr>
+        <w:spacing w:after="0" w:line="240" w:lineRule="auto"/>
+        <w:rPr>
+          <w:rFonts w:eastAsia="Times New Roman" w:cs="Times New Roman"/>
+          <w:kern w:val="0"/>
+          <w:sz w:val="20"/>
+          <w:szCs w:val="20"/>
+          <w:lang w:eastAsia="en-IN"/>
+          <w14:ligatures w14:val="none"/>
+        </w:rPr>
+      </w:pPr>
+      <w:r>
+        <w:rPr>
+          <w:rFonts w:eastAsia="Times New Roman" w:cs="Times New Roman"/>
+          <w:b/>
+          <w:bCs/>
+          <w:kern w:val="0"/>
+          <w:sz w:val="20"/>
+          <w:szCs w:val="20"/>
+          <w:lang w:eastAsia="en-IN"/>
+          <w14:ligatures w14:val="none"/>
+        </w:rPr>
+        <w:t>Initial RAG Integration and Setup</w:t>
+      </w:r>
+      <w:r>
+        <w:rPr>
+          <w:rFonts w:eastAsia="Times New Roman" w:cs="Times New Roman"/>
+          <w:kern w:val="0"/>
+          <w:sz w:val="20"/>
+          <w:szCs w:val="20"/>
+          <w:lang w:eastAsia="en-IN"/>
+          <w14:ligatures w14:val="none"/>
+        </w:rPr>
+        <w:br/>
+        <w:t xml:space="preserve">Started by adding a simple RAG pipeline on top of the existing benchmarking system to generate answers for a small set of queries. Decided to limit LLM generation to only 3 sample queries to avoid affecting benchmarking performance. A PPT was also created to explain what is completed so far and what remains to be done. </w:t>
+      </w:r>
+    </w:p>
+    <w:p>
+      <w:pPr>
+        <w:pStyle w:val="ListParagraph"/>
+        <w:numPr>
+          <w:ilvl w:val="1"/>
+          <w:numId w:val="47"/>
+        </w:numPr>
+        <w:spacing w:after="0" w:line="240" w:lineRule="auto"/>
+        <w:rPr>
+          <w:rFonts w:eastAsia="Times New Roman" w:cs="Times New Roman"/>
+          <w:kern w:val="0"/>
+          <w:sz w:val="20"/>
+          <w:szCs w:val="20"/>
+          <w:lang w:eastAsia="en-IN"/>
+          <w14:ligatures w14:val="none"/>
+        </w:rPr>
+      </w:pPr>
+      <w:r>
+        <w:rPr>
+          <w:rFonts w:eastAsia="Times New Roman" w:cs="Times New Roman"/>
+          <w:b/>
+          <w:bCs/>
+          <w:kern w:val="0"/>
+          <w:sz w:val="20"/>
+          <w:szCs w:val="20"/>
+          <w:lang w:eastAsia="en-IN"/>
+          <w14:ligatures w14:val="none"/>
+        </w:rPr>
+        <w:t>Embedding and Data Format Issues</w:t>
+      </w:r>
+      <w:r>
+        <w:rPr>
+          <w:rFonts w:eastAsia="Times New Roman" w:cs="Times New Roman"/>
+          <w:kern w:val="0"/>
+          <w:sz w:val="20"/>
+          <w:szCs w:val="20"/>
+          <w:lang w:eastAsia="en-IN"/>
+          <w14:ligatures w14:val="none"/>
+        </w:rPr>
+        <w:br/>
+        <w:t xml:space="preserve">Faced errors with the embedder due to incorrect input formats (passing </w:t>
+      </w:r>
+      <w:proofErr w:type="spellStart"/>
+      <w:r>
+        <w:rPr>
+          <w:rFonts w:eastAsia="Times New Roman" w:cs="Times New Roman"/>
+          <w:kern w:val="0"/>
+          <w:sz w:val="20"/>
+          <w:szCs w:val="20"/>
+          <w:lang w:eastAsia="en-IN"/>
+          <w14:ligatures w14:val="none"/>
+        </w:rPr>
+        <w:t>dicts</w:t>
+      </w:r>
+      <w:proofErr w:type="spellEnd"/>
+      <w:r>
+        <w:rPr>
+          <w:rFonts w:eastAsia="Times New Roman" w:cs="Times New Roman"/>
+          <w:kern w:val="0"/>
+          <w:sz w:val="20"/>
+          <w:szCs w:val="20"/>
+          <w:lang w:eastAsia="en-IN"/>
+          <w14:ligatures w14:val="none"/>
+        </w:rPr>
+        <w:t xml:space="preserve"> instead of strings) and misuse of methods </w:t>
+      </w:r>
+      <w:proofErr w:type="gramStart"/>
+      <w:r>
+        <w:rPr>
+          <w:rFonts w:eastAsia="Times New Roman" w:cs="Times New Roman"/>
+          <w:kern w:val="0"/>
+          <w:sz w:val="20"/>
+          <w:szCs w:val="20"/>
+          <w:lang w:eastAsia="en-IN"/>
+          <w14:ligatures w14:val="none"/>
+        </w:rPr>
+        <w:t xml:space="preserve">like </w:t>
+      </w:r>
+      <w:r>
+        <w:rPr>
+          <w:rFonts w:eastAsia="Times New Roman" w:cs="Courier New"/>
+          <w:kern w:val="0"/>
+          <w:sz w:val="20"/>
+          <w:szCs w:val="20"/>
+          <w:lang w:eastAsia="en-IN"/>
+          <w14:ligatures w14:val="none"/>
+        </w:rPr>
+        <w:t>.encode</w:t>
+      </w:r>
+      <w:proofErr w:type="gramEnd"/>
+      <w:r>
+        <w:rPr>
+          <w:rFonts w:eastAsia="Times New Roman" w:cs="Courier New"/>
+          <w:kern w:val="0"/>
+          <w:sz w:val="20"/>
+          <w:szCs w:val="20"/>
+          <w:lang w:eastAsia="en-IN"/>
+          <w14:ligatures w14:val="none"/>
+        </w:rPr>
+        <w:t>()</w:t>
+      </w:r>
+      <w:r>
+        <w:rPr>
+          <w:rFonts w:eastAsia="Times New Roman" w:cs="Times New Roman"/>
+          <w:kern w:val="0"/>
+          <w:sz w:val="20"/>
+          <w:szCs w:val="20"/>
+          <w:lang w:eastAsia="en-IN"/>
+          <w14:ligatures w14:val="none"/>
+        </w:rPr>
+        <w:t xml:space="preserve">. Fixed this by standardizing inputs to the embedder and adding batching, along with temporarily disabling cached embeddings to avoid mismatch issues. </w:t>
+      </w:r>
+    </w:p>
+    <w:p>
+      <w:pPr>
+        <w:pStyle w:val="ListParagraph"/>
+        <w:numPr>
+          <w:ilvl w:val="1"/>
+          <w:numId w:val="47"/>
+        </w:numPr>
+        <w:spacing w:after="0" w:line="240" w:lineRule="auto"/>
+        <w:rPr>
+          <w:rFonts w:eastAsia="Times New Roman" w:cs="Times New Roman"/>
+          <w:kern w:val="0"/>
+          <w:sz w:val="20"/>
+          <w:szCs w:val="20"/>
+          <w:lang w:eastAsia="en-IN"/>
+          <w14:ligatures w14:val="none"/>
+        </w:rPr>
+      </w:pPr>
+      <w:r>
+        <w:rPr>
+          <w:rFonts w:eastAsia="Times New Roman" w:cs="Times New Roman"/>
+          <w:b/>
+          <w:bCs/>
+          <w:kern w:val="0"/>
+          <w:sz w:val="20"/>
+          <w:szCs w:val="20"/>
+          <w:lang w:eastAsia="en-IN"/>
+          <w14:ligatures w14:val="none"/>
+        </w:rPr>
+        <w:t>Incorrect Retrieval and Garbage Chunks</w:t>
+      </w:r>
+      <w:r>
+        <w:rPr>
+          <w:rFonts w:eastAsia="Times New Roman" w:cs="Times New Roman"/>
+          <w:kern w:val="0"/>
+          <w:sz w:val="20"/>
+          <w:szCs w:val="20"/>
+          <w:lang w:eastAsia="en-IN"/>
+          <w14:ligatures w14:val="none"/>
+        </w:rPr>
+        <w:br/>
+        <w:t>Observed meaningless outputs like “</w:t>
+      </w:r>
+      <w:proofErr w:type="spellStart"/>
+      <w:r>
+        <w:rPr>
+          <w:rFonts w:eastAsia="Times New Roman" w:cs="Times New Roman"/>
+          <w:kern w:val="0"/>
+          <w:sz w:val="20"/>
+          <w:szCs w:val="20"/>
+          <w:lang w:eastAsia="en-IN"/>
+          <w14:ligatures w14:val="none"/>
+        </w:rPr>
+        <w:t>rnia</w:t>
+      </w:r>
+      <w:proofErr w:type="spellEnd"/>
+      <w:r>
+        <w:rPr>
+          <w:rFonts w:eastAsia="Times New Roman" w:cs="Times New Roman"/>
+          <w:kern w:val="0"/>
+          <w:sz w:val="20"/>
+          <w:szCs w:val="20"/>
+          <w:lang w:eastAsia="en-IN"/>
+          <w14:ligatures w14:val="none"/>
+        </w:rPr>
+        <w:t>” and “</w:t>
+      </w:r>
+      <w:proofErr w:type="spellStart"/>
+      <w:r>
+        <w:rPr>
+          <w:rFonts w:eastAsia="Times New Roman" w:cs="Times New Roman"/>
+          <w:kern w:val="0"/>
+          <w:sz w:val="20"/>
+          <w:szCs w:val="20"/>
+          <w:lang w:eastAsia="en-IN"/>
+          <w14:ligatures w14:val="none"/>
+        </w:rPr>
+        <w:t>ucharest</w:t>
+      </w:r>
+      <w:proofErr w:type="spellEnd"/>
+      <w:r>
+        <w:rPr>
+          <w:rFonts w:eastAsia="Times New Roman" w:cs="Times New Roman"/>
+          <w:kern w:val="0"/>
+          <w:sz w:val="20"/>
+          <w:szCs w:val="20"/>
+          <w:lang w:eastAsia="en-IN"/>
+          <w14:ligatures w14:val="none"/>
+        </w:rPr>
+        <w:t xml:space="preserve">”, which indicated broken retrieval. Debugging revealed issues with embedding mismatch and inconsistent data handling between stored chunks and embeddings, which were resolved by recomputing embeddings and fixing input pipelines. </w:t>
+      </w:r>
+    </w:p>
+    <w:p>
+      <w:pPr>
+        <w:pStyle w:val="ListParagraph"/>
+        <w:numPr>
+          <w:ilvl w:val="1"/>
+          <w:numId w:val="47"/>
+        </w:numPr>
+        <w:spacing w:after="0" w:line="240" w:lineRule="auto"/>
+        <w:rPr>
+          <w:rFonts w:eastAsia="Times New Roman" w:cs="Times New Roman"/>
+          <w:kern w:val="0"/>
+          <w:sz w:val="20"/>
+          <w:szCs w:val="20"/>
+          <w:lang w:eastAsia="en-IN"/>
+          <w14:ligatures w14:val="none"/>
+        </w:rPr>
+      </w:pPr>
+      <w:proofErr w:type="spellStart"/>
+      <w:r>
+        <w:rPr>
+          <w:rFonts w:eastAsia="Times New Roman" w:cs="Times New Roman"/>
+          <w:b/>
+          <w:bCs/>
+          <w:kern w:val="0"/>
+          <w:sz w:val="20"/>
+          <w:szCs w:val="20"/>
+          <w:lang w:eastAsia="en-IN"/>
+          <w14:ligatures w14:val="none"/>
+        </w:rPr>
+        <w:t>DuckDB</w:t>
+      </w:r>
+      <w:proofErr w:type="spellEnd"/>
+      <w:r>
+        <w:rPr>
+          <w:rFonts w:eastAsia="Times New Roman" w:cs="Times New Roman"/>
+          <w:b/>
+          <w:bCs/>
+          <w:kern w:val="0"/>
+          <w:sz w:val="20"/>
+          <w:szCs w:val="20"/>
+          <w:lang w:eastAsia="en-IN"/>
+          <w14:ligatures w14:val="none"/>
+        </w:rPr>
+        <w:t xml:space="preserve"> Storage and Chunk Management Fixes</w:t>
+      </w:r>
+      <w:r>
+        <w:rPr>
+          <w:rFonts w:eastAsia="Times New Roman" w:cs="Times New Roman"/>
+          <w:kern w:val="0"/>
+          <w:sz w:val="20"/>
+          <w:szCs w:val="20"/>
+          <w:lang w:eastAsia="en-IN"/>
+          <w14:ligatures w14:val="none"/>
+        </w:rPr>
+        <w:br/>
+        <w:t xml:space="preserve">Identified that old data was persisting in </w:t>
+      </w:r>
+      <w:proofErr w:type="spellStart"/>
+      <w:r>
+        <w:rPr>
+          <w:rFonts w:eastAsia="Times New Roman" w:cs="Times New Roman"/>
+          <w:kern w:val="0"/>
+          <w:sz w:val="20"/>
+          <w:szCs w:val="20"/>
+          <w:lang w:eastAsia="en-IN"/>
+          <w14:ligatures w14:val="none"/>
+        </w:rPr>
+        <w:t>DuckDB</w:t>
+      </w:r>
+      <w:proofErr w:type="spellEnd"/>
+      <w:r>
+        <w:rPr>
+          <w:rFonts w:eastAsia="Times New Roman" w:cs="Times New Roman"/>
+          <w:kern w:val="0"/>
+          <w:sz w:val="20"/>
+          <w:szCs w:val="20"/>
+          <w:lang w:eastAsia="en-IN"/>
+          <w14:ligatures w14:val="none"/>
+        </w:rPr>
+        <w:t xml:space="preserve">, causing inconsistencies, so added logic to clear the table before inserting new chunks. Also corrected the image chunk loader to include </w:t>
+      </w:r>
+      <w:proofErr w:type="spellStart"/>
+      <w:r>
+        <w:rPr>
+          <w:rFonts w:eastAsia="Times New Roman" w:cs="Courier New"/>
+          <w:kern w:val="0"/>
+          <w:sz w:val="20"/>
+          <w:szCs w:val="20"/>
+          <w:lang w:eastAsia="en-IN"/>
+          <w14:ligatures w14:val="none"/>
+        </w:rPr>
+        <w:lastRenderedPageBreak/>
+        <w:t>image_path</w:t>
+      </w:r>
+      <w:proofErr w:type="spellEnd"/>
+      <w:r>
+        <w:rPr>
+          <w:rFonts w:eastAsia="Times New Roman" w:cs="Times New Roman"/>
+          <w:kern w:val="0"/>
+          <w:sz w:val="20"/>
+          <w:szCs w:val="20"/>
+          <w:lang w:eastAsia="en-IN"/>
+          <w14:ligatures w14:val="none"/>
+        </w:rPr>
+        <w:t xml:space="preserve">, and ensured chunk IDs were properly stored and retrieved, improving consistency across the pipeline. </w:t>
+      </w:r>
+    </w:p>
+    <w:p>
+      <w:pPr>
+        <w:pStyle w:val="ListParagraph"/>
+        <w:numPr>
+          <w:ilvl w:val="1"/>
+          <w:numId w:val="47"/>
+        </w:numPr>
+        <w:rPr>
+          <w:sz w:val="20"/>
+          <w:szCs w:val="20"/>
+        </w:rPr>
+      </w:pPr>
+      <w:r>
+        <w:rPr>
+          <w:rFonts w:eastAsia="Times New Roman" w:cs="Times New Roman"/>
+          <w:b/>
+          <w:bCs/>
+          <w:kern w:val="0"/>
+          <w:sz w:val="20"/>
+          <w:szCs w:val="20"/>
+          <w:lang w:eastAsia="en-IN"/>
+          <w14:ligatures w14:val="none"/>
+        </w:rPr>
+        <w:t>Final Debugging, Query Handling, and Custom RAG Queries</w:t>
+      </w:r>
+      <w:r>
+        <w:rPr>
+          <w:rFonts w:eastAsia="Times New Roman" w:cs="Times New Roman"/>
+          <w:kern w:val="0"/>
+          <w:sz w:val="20"/>
+          <w:szCs w:val="20"/>
+          <w:lang w:eastAsia="en-IN"/>
+          <w14:ligatures w14:val="none"/>
+        </w:rPr>
+        <w:br/>
+        <w:t xml:space="preserve">Fixed errors in custom query handling (incorrect list indexing with dictionaries) and ensured proper structure for user-defined queries. Verified chunk overlap logic and database </w:t>
+      </w:r>
+      <w:proofErr w:type="gramStart"/>
+      <w:r>
+        <w:rPr>
+          <w:rFonts w:eastAsia="Times New Roman" w:cs="Times New Roman"/>
+          <w:kern w:val="0"/>
+          <w:sz w:val="20"/>
+          <w:szCs w:val="20"/>
+          <w:lang w:eastAsia="en-IN"/>
+          <w14:ligatures w14:val="none"/>
+        </w:rPr>
+        <w:t>content, and</w:t>
+      </w:r>
+      <w:proofErr w:type="gramEnd"/>
+      <w:r>
+        <w:rPr>
+          <w:rFonts w:eastAsia="Times New Roman" w:cs="Times New Roman"/>
+          <w:kern w:val="0"/>
+          <w:sz w:val="20"/>
+          <w:szCs w:val="20"/>
+          <w:lang w:eastAsia="en-IN"/>
+          <w14:ligatures w14:val="none"/>
+        </w:rPr>
+        <w:t xml:space="preserve"> added debugging prints to validate each stage. The system now supports both random and custom queries for RAG while keeping benchmarking intact.</w:t>
+      </w:r>
+    </w:p>
+    <w:p>
+      <w:pPr>
+        <w:ind w:left="360"/>
+        <w:rPr>
+          <w:sz w:val="20"/>
+          <w:szCs w:val="20"/>
+        </w:rPr>
+      </w:pPr>
+    </w:p>
+    <w:p>
+      <w:pPr>
+        <w:pStyle w:val="ListParagraph"/>
+        <w:numPr>
+          <w:ilvl w:val="0"/>
+          <w:numId w:val="24"/>
+        </w:numPr>
+        <w:rPr>
+          <w:sz w:val="26"/>
+          <w:szCs w:val="26"/>
+        </w:rPr>
+      </w:pPr>
+      <w:r>
+        <w:rPr>
+          <w:sz w:val="26"/>
+          <w:szCs w:val="26"/>
+        </w:rPr>
+        <w:t xml:space="preserve">Image Recall, Precision and </w:t>
+      </w:r>
+      <w:proofErr w:type="gramStart"/>
+      <w:r>
+        <w:rPr>
+          <w:sz w:val="26"/>
+          <w:szCs w:val="26"/>
+        </w:rPr>
+        <w:t>RAG</w:t>
+      </w:r>
+      <w:r>
+        <w:rPr>
+          <w:sz w:val="26"/>
+          <w:szCs w:val="26"/>
+        </w:rPr>
+        <w:t>(</w:t>
+      </w:r>
+      <w:proofErr w:type="gramEnd"/>
+      <w:r>
+        <w:rPr>
+          <w:sz w:val="26"/>
+          <w:szCs w:val="26"/>
+        </w:rPr>
+        <w:t>12-18 April)</w:t>
+      </w:r>
+    </w:p>
+    <w:p>
+      <w:pPr>
+        <w:pStyle w:val="ListParagraph"/>
+        <w:numPr>
+          <w:ilvl w:val="1"/>
+          <w:numId w:val="50"/>
+        </w:numPr>
+        <w:spacing w:after="0" w:line="240" w:lineRule="auto"/>
+        <w:rPr>
+          <w:rFonts w:eastAsia="Times New Roman" w:cs="Times New Roman"/>
+          <w:kern w:val="0"/>
+          <w:sz w:val="20"/>
+          <w:szCs w:val="20"/>
+          <w:lang w:eastAsia="en-IN"/>
+          <w14:ligatures w14:val="none"/>
+        </w:rPr>
+      </w:pPr>
+      <w:r>
+        <w:rPr>
+          <w:rFonts w:eastAsia="Times New Roman" w:cs="Times New Roman"/>
+          <w:b/>
+          <w:bCs/>
+          <w:kern w:val="0"/>
+          <w:sz w:val="20"/>
+          <w:szCs w:val="20"/>
+          <w:lang w:eastAsia="en-IN"/>
+          <w14:ligatures w14:val="none"/>
+        </w:rPr>
+        <w:t>Initially</w:t>
+      </w:r>
+      <w:r>
+        <w:rPr>
+          <w:rFonts w:eastAsia="Times New Roman" w:cs="Times New Roman"/>
+          <w:kern w:val="0"/>
+          <w:sz w:val="20"/>
+          <w:szCs w:val="20"/>
+          <w:lang w:eastAsia="en-IN"/>
+          <w14:ligatures w14:val="none"/>
+        </w:rPr>
+        <w:t xml:space="preserve">, there were issues with the RAG and benchmarking pipeline, including unrealistic query timings and recall values (e.g., very high throughput and near-zero recall). This led to debugging the embedding flow, fixing dimension mismatches, and ensuring embeddings and queries were computed correctly instead of being reused or cached incorrectly. The pipeline was stabilized so that query execution and benchmarking metrics became meaningful. </w:t>
+      </w:r>
+    </w:p>
+    <w:p>
+      <w:pPr>
+        <w:pStyle w:val="ListParagraph"/>
+        <w:numPr>
+          <w:ilvl w:val="1"/>
+          <w:numId w:val="50"/>
+        </w:numPr>
+        <w:spacing w:after="0" w:line="240" w:lineRule="auto"/>
+        <w:rPr>
+          <w:rFonts w:eastAsia="Times New Roman" w:cs="Times New Roman"/>
+          <w:kern w:val="0"/>
+          <w:sz w:val="20"/>
+          <w:szCs w:val="20"/>
+          <w:lang w:eastAsia="en-IN"/>
+          <w14:ligatures w14:val="none"/>
+        </w:rPr>
+      </w:pPr>
+      <w:r>
+        <w:rPr>
+          <w:rFonts w:eastAsia="Times New Roman" w:cs="Times New Roman"/>
+          <w:b/>
+          <w:bCs/>
+          <w:kern w:val="0"/>
+          <w:sz w:val="20"/>
+          <w:szCs w:val="20"/>
+          <w:lang w:eastAsia="en-IN"/>
+          <w14:ligatures w14:val="none"/>
+        </w:rPr>
+        <w:t>The image retrieval pipeline</w:t>
+      </w:r>
+      <w:r>
+        <w:rPr>
+          <w:rFonts w:eastAsia="Times New Roman" w:cs="Times New Roman"/>
+          <w:kern w:val="0"/>
+          <w:sz w:val="20"/>
+          <w:szCs w:val="20"/>
+          <w:lang w:eastAsia="en-IN"/>
+          <w14:ligatures w14:val="none"/>
+        </w:rPr>
+        <w:t xml:space="preserve"> was then extended using CLIP embeddings, but issues arose with missing metadata and incorrect mappings between embeddings and image IDs. This was resolved by storing proper metadata (</w:t>
+      </w:r>
+      <w:proofErr w:type="spellStart"/>
+      <w:r>
+        <w:rPr>
+          <w:rFonts w:eastAsia="Times New Roman" w:cs="Times New Roman"/>
+          <w:kern w:val="0"/>
+          <w:sz w:val="20"/>
+          <w:szCs w:val="20"/>
+          <w:lang w:eastAsia="en-IN"/>
+          <w14:ligatures w14:val="none"/>
+        </w:rPr>
+        <w:t>image_id</w:t>
+      </w:r>
+      <w:proofErr w:type="spellEnd"/>
+      <w:r>
+        <w:rPr>
+          <w:rFonts w:eastAsia="Times New Roman" w:cs="Times New Roman"/>
+          <w:kern w:val="0"/>
+          <w:sz w:val="20"/>
+          <w:szCs w:val="20"/>
+          <w:lang w:eastAsia="en-IN"/>
+          <w14:ligatures w14:val="none"/>
+        </w:rPr>
+        <w:t xml:space="preserve">, caption, path) in the vector database and modifying the query logic to retrieve and display images correctly. Additional fixes included handling None values in metadata and ensuring compatibility with </w:t>
+      </w:r>
+      <w:proofErr w:type="spellStart"/>
+      <w:r>
+        <w:rPr>
+          <w:rFonts w:eastAsia="Times New Roman" w:cs="Times New Roman"/>
+          <w:kern w:val="0"/>
+          <w:sz w:val="20"/>
+          <w:szCs w:val="20"/>
+          <w:lang w:eastAsia="en-IN"/>
+          <w14:ligatures w14:val="none"/>
+        </w:rPr>
+        <w:t>ChromaDB</w:t>
+      </w:r>
+      <w:proofErr w:type="spellEnd"/>
+      <w:r>
+        <w:rPr>
+          <w:rFonts w:eastAsia="Times New Roman" w:cs="Times New Roman"/>
+          <w:kern w:val="0"/>
+          <w:sz w:val="20"/>
+          <w:szCs w:val="20"/>
+          <w:lang w:eastAsia="en-IN"/>
+          <w14:ligatures w14:val="none"/>
+        </w:rPr>
+        <w:t xml:space="preserve"> requirements. </w:t>
+      </w:r>
+    </w:p>
+    <w:p>
+      <w:pPr>
+        <w:pStyle w:val="ListParagraph"/>
+        <w:numPr>
+          <w:ilvl w:val="1"/>
+          <w:numId w:val="50"/>
+        </w:numPr>
+        <w:spacing w:after="0" w:line="240" w:lineRule="auto"/>
+        <w:rPr>
+          <w:rFonts w:eastAsia="Times New Roman" w:cs="Times New Roman"/>
+          <w:kern w:val="0"/>
+          <w:sz w:val="20"/>
+          <w:szCs w:val="20"/>
+          <w:lang w:eastAsia="en-IN"/>
+          <w14:ligatures w14:val="none"/>
+        </w:rPr>
+      </w:pPr>
+      <w:r>
+        <w:rPr>
+          <w:rFonts w:eastAsia="Times New Roman" w:cs="Times New Roman"/>
+          <w:b/>
+          <w:bCs/>
+          <w:kern w:val="0"/>
+          <w:sz w:val="20"/>
+          <w:szCs w:val="20"/>
+          <w:lang w:eastAsia="en-IN"/>
+          <w14:ligatures w14:val="none"/>
+        </w:rPr>
+        <w:t>During retrieval, ranking issues</w:t>
+      </w:r>
+      <w:r>
+        <w:rPr>
+          <w:rFonts w:eastAsia="Times New Roman" w:cs="Times New Roman"/>
+          <w:kern w:val="0"/>
+          <w:sz w:val="20"/>
+          <w:szCs w:val="20"/>
+          <w:lang w:eastAsia="en-IN"/>
+          <w14:ligatures w14:val="none"/>
+        </w:rPr>
+        <w:t xml:space="preserve"> were observed where irrelevant images (e.g., moon crater) were ranked above relevant ones (e.g., volcano). This led to implementing top-k retrieval with reranking using caption similarity and fixing tokenizer errors (CLIP 77 token limit with truncation). The final pipeline successfully retrieves the most relevant image and handles noisy captions more robustly. </w:t>
+      </w:r>
+    </w:p>
+    <w:p>
+      <w:pPr>
+        <w:pStyle w:val="ListParagraph"/>
+        <w:numPr>
+          <w:ilvl w:val="1"/>
+          <w:numId w:val="50"/>
+        </w:numPr>
+        <w:spacing w:after="0" w:line="240" w:lineRule="auto"/>
+        <w:rPr>
+          <w:rFonts w:eastAsia="Times New Roman" w:cs="Times New Roman"/>
+          <w:kern w:val="0"/>
+          <w:sz w:val="20"/>
+          <w:szCs w:val="20"/>
+          <w:lang w:eastAsia="en-IN"/>
+          <w14:ligatures w14:val="none"/>
+        </w:rPr>
+      </w:pPr>
+      <w:r>
+        <w:rPr>
+          <w:rFonts w:eastAsia="Times New Roman" w:cs="Times New Roman"/>
+          <w:b/>
+          <w:bCs/>
+          <w:kern w:val="0"/>
+          <w:sz w:val="20"/>
+          <w:szCs w:val="20"/>
+          <w:lang w:eastAsia="en-IN"/>
+          <w14:ligatures w14:val="none"/>
+        </w:rPr>
+        <w:t>For evaluation</w:t>
+      </w:r>
+      <w:r>
+        <w:rPr>
+          <w:rFonts w:eastAsia="Times New Roman" w:cs="Times New Roman"/>
+          <w:kern w:val="0"/>
+          <w:sz w:val="20"/>
+          <w:szCs w:val="20"/>
+          <w:lang w:eastAsia="en-IN"/>
+          <w14:ligatures w14:val="none"/>
+        </w:rPr>
+        <w:t xml:space="preserve">, recall and precision logic was revisited. The initial approach used maximum cosine similarity, which was incorrect, and was replaced with threshold-based recall (binary relevance) and </w:t>
+      </w:r>
+      <w:proofErr w:type="spellStart"/>
+      <w:r>
+        <w:rPr>
+          <w:rFonts w:eastAsia="Times New Roman" w:cs="Times New Roman"/>
+          <w:kern w:val="0"/>
+          <w:sz w:val="20"/>
+          <w:szCs w:val="20"/>
+          <w:lang w:eastAsia="en-IN"/>
+          <w14:ligatures w14:val="none"/>
+        </w:rPr>
+        <w:t>precision@k</w:t>
+      </w:r>
+      <w:proofErr w:type="spellEnd"/>
+      <w:r>
+        <w:rPr>
+          <w:rFonts w:eastAsia="Times New Roman" w:cs="Times New Roman"/>
+          <w:kern w:val="0"/>
+          <w:sz w:val="20"/>
+          <w:szCs w:val="20"/>
+          <w:lang w:eastAsia="en-IN"/>
+          <w14:ligatures w14:val="none"/>
+        </w:rPr>
+        <w:t xml:space="preserve"> using similarity thresholds. A discussion was done on limitations of embedding-based evaluation and the possibility of using LLM-based evaluation (REALLMS) for semantic </w:t>
+      </w:r>
+      <w:proofErr w:type="gramStart"/>
+      <w:r>
+        <w:rPr>
+          <w:rFonts w:eastAsia="Times New Roman" w:cs="Times New Roman"/>
+          <w:kern w:val="0"/>
+          <w:sz w:val="20"/>
+          <w:szCs w:val="20"/>
+          <w:lang w:eastAsia="en-IN"/>
+          <w14:ligatures w14:val="none"/>
+        </w:rPr>
+        <w:t>relevance,</w:t>
+      </w:r>
+      <w:proofErr w:type="gramEnd"/>
+      <w:r>
+        <w:rPr>
+          <w:rFonts w:eastAsia="Times New Roman" w:cs="Times New Roman"/>
+          <w:kern w:val="0"/>
+          <w:sz w:val="20"/>
+          <w:szCs w:val="20"/>
+          <w:lang w:eastAsia="en-IN"/>
+          <w14:ligatures w14:val="none"/>
+        </w:rPr>
+        <w:t xml:space="preserve"> while keeping it separate due to latency concerns. </w:t>
+      </w:r>
+    </w:p>
+    <w:p>
+      <w:pPr>
+        <w:pStyle w:val="ListParagraph"/>
+        <w:numPr>
+          <w:ilvl w:val="1"/>
+          <w:numId w:val="50"/>
+        </w:numPr>
+        <w:rPr>
+          <w:sz w:val="22"/>
+          <w:szCs w:val="22"/>
+        </w:rPr>
+      </w:pPr>
+      <w:r>
+        <w:rPr>
+          <w:rFonts w:eastAsia="Times New Roman" w:cs="Times New Roman"/>
+          <w:b/>
+          <w:bCs/>
+          <w:kern w:val="0"/>
+          <w:sz w:val="20"/>
+          <w:szCs w:val="20"/>
+          <w:lang w:eastAsia="en-IN"/>
+          <w14:ligatures w14:val="none"/>
+        </w:rPr>
+        <w:t>Finally, performance analysis</w:t>
+      </w:r>
+      <w:r>
+        <w:rPr>
+          <w:rFonts w:eastAsia="Times New Roman" w:cs="Times New Roman"/>
+          <w:kern w:val="0"/>
+          <w:sz w:val="20"/>
+          <w:szCs w:val="20"/>
+          <w:lang w:eastAsia="en-IN"/>
+          <w14:ligatures w14:val="none"/>
+        </w:rPr>
+        <w:t xml:space="preserve"> was improved by adding detailed timing breakdowns across the pipeline, including embedding time, vector DB query time, post-processing time, and full pipeline latency. A PPT was prepared summarizing work done and next steps, including diagrams, recall/precision tables, and planned improvements such as better evaluation methods and visualization of latency distributions.</w:t>
+      </w:r>
+    </w:p>
+    <w:p>
+      <w:pPr>
+        <w:ind w:left="360"/>
+        <w:rPr>
+          <w:sz w:val="22"/>
+          <w:szCs w:val="22"/>
+        </w:rPr>
+      </w:pPr>
+    </w:p>
+    <w:p>
+      <w:pPr>
+        <w:pStyle w:val="ListParagraph"/>
+        <w:numPr>
+          <w:ilvl w:val="0"/>
+          <w:numId w:val="24"/>
+        </w:numPr>
+        <w:rPr>
+          <w:sz w:val="26"/>
+          <w:szCs w:val="26"/>
+        </w:rPr>
+      </w:pPr>
+      <w:r>
+        <w:rPr>
+          <w:sz w:val="26"/>
+          <w:szCs w:val="26"/>
+        </w:rPr>
+        <w:t>(19-25 April)</w:t>
+      </w:r>
+    </w:p>
+    <w:p>
+      <w:pPr>
+        <w:pStyle w:val="ListParagraph"/>
+        <w:numPr>
+          <w:ilvl w:val="0"/>
+          <w:numId w:val="24"/>
+        </w:numPr>
+        <w:rPr>
+          <w:sz w:val="26"/>
+          <w:szCs w:val="26"/>
+        </w:rPr>
+      </w:pPr>
+      <w:r>
+        <w:rPr>
+          <w:sz w:val="26"/>
+          <w:szCs w:val="26"/>
+        </w:rPr>
+        <w:t>(26 April – 2 May)</w:t>
+      </w:r>
+    </w:p>
+    <w:p>
+      <w:pPr>
+        <w:rPr>
+          <w:sz w:val="26"/>
+          <w:szCs w:val="26"/>
+        </w:rPr>
+      </w:pPr>
     </w:p>
     <w:sectPr>
+      <w:headerReference w:type="default" r:id="rId11"/>
       <w:pgSz w:w="11906" w:h="16838"/>
-      <w:pgMar w:top="1440" w:right="1440" w:bottom="1440" w:left="1440" w:header="708" w:footer="708" w:gutter="0"/>
+      <w:pgMar w:top="1134" w:right="1440" w:bottom="993" w:left="1440" w:header="284" w:footer="708" w:gutter="0"/>
       <w:cols w:space="708"/>
+      <w:titlePg/>
       <w:docGrid w:linePitch="360"/>
     </w:sectPr>
   </w:body>
 </w:document>
+</file>
+
+<file path=word/endnotes.xml><?xml version="1.0" encoding="utf-8"?>
+<w:endnotes xmlns:wpc="http://schemas.microsoft.com/office/word/2010/wordprocessingCanvas" xmlns:cx="http://schemas.microsoft.com/office/drawing/2014/chartex" xmlns:cx1="http://schemas.microsoft.com/office/drawing/2015/9/8/chartex" xmlns:cx2="http://schemas.microsoft.com/office/drawing/2015/10/21/chartex" xmlns:cx3="http://schemas.microsoft.com/office/drawing/2016/5/9/chartex" xmlns:cx4="http://schemas.microsoft.com/office/drawing/2016/5/10/chartex" xmlns:cx5="http://schemas.microsoft.com/office/drawing/2016/5/11/chartex" xmlns:cx6="http://schemas.microsoft.com/office/drawing/2016/5/12/chartex" xmlns:cx7="http://schemas.microsoft.com/office/drawing/2016/5/13/chartex" xmlns:cx8="http://schemas.microsoft.com/office/drawing/2016/5/14/chartex" xmlns:mc="http://schemas.openxmlformats.org/markup-compatibility/2006" xmlns:aink="http://schemas.microsoft.com/office/drawing/2016/ink" xmlns:am3d="http://schemas.microsoft.com/office/drawing/2017/model3d" xmlns:o="urn:schemas-microsoft-com:office:office" xmlns:oel="http://schemas.microsoft.com/office/2019/extlst" xmlns:r="http://schemas.openxmlformats.org/officeDocument/2006/relationships" xmlns:m="http://schemas.openxmlformats.org/officeDocument/2006/math" xmlns:v="urn:schemas-microsoft-com:vml" xmlns:wp14="http://schemas.microsoft.com/office/word/2010/wordprocessingDrawing" xmlns:wp="http://schemas.openxmlformats.org/drawingml/2006/wordprocessingDrawing" xmlns:w10="urn:schemas-microsoft-com:office:word" xmlns:w="http://schemas.openxmlformats.org/wordprocessingml/2006/main" xmlns:w14="http://schemas.microsoft.com/office/word/2010/wordml" xmlns:w15="http://schemas.microsoft.com/office/word/2012/wordml" xmlns:w16cex="http://schemas.microsoft.com/office/word/2018/wordml/cex" xmlns:w16cid="http://schemas.microsoft.com/office/word/2016/wordml/cid" xmlns:w16="http://schemas.microsoft.com/office/word/2018/wordml" xmlns:w16du="http://schemas.microsoft.com/office/word/2023/wordml/word16du" xmlns:w16sdtdh="http://schemas.microsoft.com/office/word/2020/wordml/sdtdatahash" xmlns:w16sdtfl="http://schemas.microsoft.com/office/word/2024/wordml/sdtformatlock" xmlns:w16se="http://schemas.microsoft.com/office/word/2015/wordml/symex" xmlns:wpg="http://schemas.microsoft.com/office/word/2010/wordprocessingGroup" xmlns:wpi="http://schemas.microsoft.com/office/word/2010/wordprocessingInk" xmlns:wne="http://schemas.microsoft.com/office/word/2006/wordml" xmlns:wps="http://schemas.microsoft.com/office/word/2010/wordprocessingShape" mc:Ignorable="w14 w15 w16se w16cid w16 w16cex w16sdtdh w16sdtfl w16du wp14">
+  <w:endnote w:type="separator" w:id="-1">
+    <w:p>
+      <w:pPr>
+        <w:spacing w:after="0" w:line="240" w:lineRule="auto"/>
+      </w:pPr>
+      <w:r>
+        <w:separator/>
+      </w:r>
+    </w:p>
+  </w:endnote>
+  <w:endnote w:type="continuationSeparator" w:id="0">
+    <w:p>
+      <w:pPr>
+        <w:spacing w:after="0" w:line="240" w:lineRule="auto"/>
+      </w:pPr>
+      <w:r>
+        <w:continuationSeparator/>
+      </w:r>
+    </w:p>
+  </w:endnote>
+</w:endnotes>
+</file>
+
+<file path=word/footnotes.xml><?xml version="1.0" encoding="utf-8"?>
+<w:footnotes xmlns:wpc="http://schemas.microsoft.com/office/word/2010/wordprocessingCanvas" xmlns:cx="http://schemas.microsoft.com/office/drawing/2014/chartex" xmlns:cx1="http://schemas.microsoft.com/office/drawing/2015/9/8/chartex" xmlns:cx2="http://schemas.microsoft.com/office/drawing/2015/10/21/chartex" xmlns:cx3="http://schemas.microsoft.com/office/drawing/2016/5/9/chartex" xmlns:cx4="http://schemas.microsoft.com/office/drawing/2016/5/10/chartex" xmlns:cx5="http://schemas.microsoft.com/office/drawing/2016/5/11/chartex" xmlns:cx6="http://schemas.microsoft.com/office/drawing/2016/5/12/chartex" xmlns:cx7="http://schemas.microsoft.com/office/drawing/2016/5/13/chartex" xmlns:cx8="http://schemas.microsoft.com/office/drawing/2016/5/14/chartex" xmlns:mc="http://schemas.openxmlformats.org/markup-compatibility/2006" xmlns:aink="http://schemas.microsoft.com/office/drawing/2016/ink" xmlns:am3d="http://schemas.microsoft.com/office/drawing/2017/model3d" xmlns:o="urn:schemas-microsoft-com:office:office" xmlns:oel="http://schemas.microsoft.com/office/2019/extlst" xmlns:r="http://schemas.openxmlformats.org/officeDocument/2006/relationships" xmlns:m="http://schemas.openxmlformats.org/officeDocument/2006/math" xmlns:v="urn:schemas-microsoft-com:vml" xmlns:wp14="http://schemas.microsoft.com/office/word/2010/wordprocessingDrawing" xmlns:wp="http://schemas.openxmlformats.org/drawingml/2006/wordprocessingDrawing" xmlns:w10="urn:schemas-microsoft-com:office:word" xmlns:w="http://schemas.openxmlformats.org/wordprocessingml/2006/main" xmlns:w14="http://schemas.microsoft.com/office/word/2010/wordml" xmlns:w15="http://schemas.microsoft.com/office/word/2012/wordml" xmlns:w16cex="http://schemas.microsoft.com/office/word/2018/wordml/cex" xmlns:w16cid="http://schemas.microsoft.com/office/word/2016/wordml/cid" xmlns:w16="http://schemas.microsoft.com/office/word/2018/wordml" xmlns:w16du="http://schemas.microsoft.com/office/word/2023/wordml/word16du" xmlns:w16sdtdh="http://schemas.microsoft.com/office/word/2020/wordml/sdtdatahash" xmlns:w16sdtfl="http://schemas.microsoft.com/office/word/2024/wordml/sdtformatlock" xmlns:w16se="http://schemas.microsoft.com/office/word/2015/wordml/symex" xmlns:wpg="http://schemas.microsoft.com/office/word/2010/wordprocessingGroup" xmlns:wpi="http://schemas.microsoft.com/office/word/2010/wordprocessingInk" xmlns:wne="http://schemas.microsoft.com/office/word/2006/wordml" xmlns:wps="http://schemas.microsoft.com/office/word/2010/wordprocessingShape" mc:Ignorable="w14 w15 w16se w16cid w16 w16cex w16sdtdh w16sdtfl w16du wp14">
+  <w:footnote w:type="separator" w:id="-1">
+    <w:p>
+      <w:pPr>
+        <w:spacing w:after="0" w:line="240" w:lineRule="auto"/>
+      </w:pPr>
+      <w:r>
+        <w:separator/>
+      </w:r>
+    </w:p>
+  </w:footnote>
+  <w:footnote w:type="continuationSeparator" w:id="0">
+    <w:p>
+      <w:pPr>
+        <w:spacing w:after="0" w:line="240" w:lineRule="auto"/>
+      </w:pPr>
+      <w:r>
+        <w:continuationSeparator/>
+      </w:r>
+    </w:p>
+  </w:footnote>
+</w:footnotes>
+</file>
+
+<file path=word/header1.xml><?xml version="1.0" encoding="utf-8"?>
+<w:hdr xmlns:wpc="http://schemas.microsoft.com/office/word/2010/wordprocessingCanvas" xmlns:cx="http://schemas.microsoft.com/office/drawing/2014/chartex" xmlns:cx1="http://schemas.microsoft.com/office/drawing/2015/9/8/chartex" xmlns:cx2="http://schemas.microsoft.com/office/drawing/2015/10/21/chartex" xmlns:cx3="http://schemas.microsoft.com/office/drawing/2016/5/9/chartex" xmlns:cx4="http://schemas.microsoft.com/office/drawing/2016/5/10/chartex" xmlns:cx5="http://schemas.microsoft.com/office/drawing/2016/5/11/chartex" xmlns:cx6="http://schemas.microsoft.com/office/drawing/2016/5/12/chartex" xmlns:cx7="http://schemas.microsoft.com/office/drawing/2016/5/13/chartex" xmlns:cx8="http://schemas.microsoft.com/office/drawing/2016/5/14/chartex" xmlns:mc="http://schemas.openxmlformats.org/markup-compatibility/2006" xmlns:aink="http://schemas.microsoft.com/office/drawing/2016/ink" xmlns:am3d="http://schemas.microsoft.com/office/drawing/2017/model3d" xmlns:o="urn:schemas-microsoft-com:office:office" xmlns:oel="http://schemas.microsoft.com/office/2019/extlst" xmlns:r="http://schemas.openxmlformats.org/officeDocument/2006/relationships" xmlns:m="http://schemas.openxmlformats.org/officeDocument/2006/math" xmlns:v="urn:schemas-microsoft-com:vml" xmlns:wp14="http://schemas.microsoft.com/office/word/2010/wordprocessingDrawing" xmlns:wp="http://schemas.openxmlformats.org/drawingml/2006/wordprocessingDrawing" xmlns:w10="urn:schemas-microsoft-com:office:word" xmlns:w="http://schemas.openxmlformats.org/wordprocessingml/2006/main" xmlns:w14="http://schemas.microsoft.com/office/word/2010/wordml" xmlns:w15="http://schemas.microsoft.com/office/word/2012/wordml" xmlns:w16cex="http://schemas.microsoft.com/office/word/2018/wordml/cex" xmlns:w16cid="http://schemas.microsoft.com/office/word/2016/wordml/cid" xmlns:w16="http://schemas.microsoft.com/office/word/2018/wordml" xmlns:w16du="http://schemas.microsoft.com/office/word/2023/wordml/word16du" xmlns:w16sdtdh="http://schemas.microsoft.com/office/word/2020/wordml/sdtdatahash" xmlns:w16sdtfl="http://schemas.microsoft.com/office/word/2024/wordml/sdtformatlock" xmlns:w16se="http://schemas.microsoft.com/office/word/2015/wordml/symex" xmlns:wpg="http://schemas.microsoft.com/office/word/2010/wordprocessingGroup" xmlns:wpi="http://schemas.microsoft.com/office/word/2010/wordprocessingInk" xmlns:wne="http://schemas.microsoft.com/office/word/2006/wordml" xmlns:wps="http://schemas.microsoft.com/office/word/2010/wordprocessingShape" mc:Ignorable="w14 w15 w16se w16cid w16 w16cex w16sdtdh w16sdtfl w16du wp14">
+  <w:sdt>
+    <w:sdtPr>
+      <w:rPr>
+        <w:sz w:val="18"/>
+        <w:szCs w:val="18"/>
+      </w:rPr>
+      <w:id w:val="-1318336367"/>
+      <w:docPartObj>
+        <w:docPartGallery w:val="Page Numbers (Top of Page)"/>
+        <w:docPartUnique/>
+      </w:docPartObj>
+    </w:sdtPr>
+    <w:sdtContent>
+      <w:p>
+        <w:pPr>
+          <w:pStyle w:val="Header"/>
+          <w:jc w:val="right"/>
+          <w:rPr>
+            <w:sz w:val="18"/>
+            <w:szCs w:val="18"/>
+          </w:rPr>
+        </w:pPr>
+        <w:r>
+          <w:rPr>
+            <w:sz w:val="18"/>
+            <w:szCs w:val="18"/>
+          </w:rPr>
+          <w:t xml:space="preserve">Page </w:t>
+        </w:r>
+        <w:r>
+          <w:rPr>
+            <w:b/>
+            <w:bCs/>
+            <w:sz w:val="18"/>
+            <w:szCs w:val="18"/>
+          </w:rPr>
+          <w:fldChar w:fldCharType="begin"/>
+        </w:r>
+        <w:r>
+          <w:rPr>
+            <w:b/>
+            <w:bCs/>
+            <w:sz w:val="18"/>
+            <w:szCs w:val="18"/>
+          </w:rPr>
+          <w:instrText xml:space="preserve"> PAGE </w:instrText>
+        </w:r>
+        <w:r>
+          <w:rPr>
+            <w:b/>
+            <w:bCs/>
+            <w:sz w:val="18"/>
+            <w:szCs w:val="18"/>
+          </w:rPr>
+          <w:fldChar w:fldCharType="separate"/>
+        </w:r>
+        <w:r>
+          <w:rPr>
+            <w:b/>
+            <w:bCs/>
+            <w:noProof/>
+            <w:sz w:val="18"/>
+            <w:szCs w:val="18"/>
+          </w:rPr>
+          <w:t>2</w:t>
+        </w:r>
+        <w:r>
+          <w:rPr>
+            <w:b/>
+            <w:bCs/>
+            <w:sz w:val="18"/>
+            <w:szCs w:val="18"/>
+          </w:rPr>
+          <w:fldChar w:fldCharType="end"/>
+        </w:r>
+        <w:r>
+          <w:rPr>
+            <w:sz w:val="18"/>
+            <w:szCs w:val="18"/>
+          </w:rPr>
+          <w:t xml:space="preserve"> of </w:t>
+        </w:r>
+        <w:r>
+          <w:rPr>
+            <w:b/>
+            <w:bCs/>
+            <w:sz w:val="18"/>
+            <w:szCs w:val="18"/>
+          </w:rPr>
+          <w:fldChar w:fldCharType="begin"/>
+        </w:r>
+        <w:r>
+          <w:rPr>
+            <w:b/>
+            <w:bCs/>
+            <w:sz w:val="18"/>
+            <w:szCs w:val="18"/>
+          </w:rPr>
+          <w:instrText xml:space="preserve"> NUMPAGES  </w:instrText>
+        </w:r>
+        <w:r>
+          <w:rPr>
+            <w:b/>
+            <w:bCs/>
+            <w:sz w:val="18"/>
+            <w:szCs w:val="18"/>
+          </w:rPr>
+          <w:fldChar w:fldCharType="separate"/>
+        </w:r>
+        <w:r>
+          <w:rPr>
+            <w:b/>
+            <w:bCs/>
+            <w:noProof/>
+            <w:sz w:val="18"/>
+            <w:szCs w:val="18"/>
+          </w:rPr>
+          <w:t>2</w:t>
+        </w:r>
+        <w:r>
+          <w:rPr>
+            <w:b/>
+            <w:bCs/>
+            <w:sz w:val="18"/>
+            <w:szCs w:val="18"/>
+          </w:rPr>
+          <w:fldChar w:fldCharType="end"/>
+        </w:r>
+      </w:p>
+    </w:sdtContent>
+  </w:sdt>
+  <w:p>
+    <w:pPr>
+      <w:pStyle w:val="Header"/>
+      <w:rPr>
+        <w:sz w:val="18"/>
+        <w:szCs w:val="18"/>
+      </w:rPr>
+    </w:pPr>
+  </w:p>
+</w:hdr>
 </file>
 
 <file path=word/numbering.xml><?xml version="1.0" encoding="utf-8"?>
@@ -4332,6 +6052,238 @@
     </w:lvl>
   </w:abstractNum>
   <w:abstractNum w:abstractNumId="6" w15:restartNumberingAfterBreak="0">
+    <w:nsid w:val="15632DD8"/>
+    <w:multiLevelType w:val="multilevel"/>
+    <w:tmpl w:val="C7A21964"/>
+    <w:lvl w:ilvl="0">
+      <w:start w:val="8"/>
+      <w:numFmt w:val="decimal"/>
+      <w:lvlText w:val="Week %1:"/>
+      <w:lvlJc w:val="left"/>
+      <w:pPr>
+        <w:ind w:left="360" w:hanging="360"/>
+      </w:pPr>
+      <w:rPr>
+        <w:rFonts w:hint="default"/>
+        <w:sz w:val="26"/>
+        <w:szCs w:val="26"/>
+      </w:rPr>
+    </w:lvl>
+    <w:lvl w:ilvl="1">
+      <w:start w:val="1"/>
+      <w:numFmt w:val="bullet"/>
+      <w:lvlText w:val=""/>
+      <w:lvlJc w:val="left"/>
+      <w:pPr>
+        <w:ind w:left="720" w:hanging="360"/>
+      </w:pPr>
+      <w:rPr>
+        <w:rFonts w:ascii="Symbol" w:hAnsi="Symbol" w:hint="default"/>
+      </w:rPr>
+    </w:lvl>
+    <w:lvl w:ilvl="2">
+      <w:start w:val="1"/>
+      <w:numFmt w:val="lowerRoman"/>
+      <w:lvlText w:val="%3)"/>
+      <w:lvlJc w:val="left"/>
+      <w:pPr>
+        <w:ind w:left="1080" w:hanging="360"/>
+      </w:pPr>
+      <w:rPr>
+        <w:rFonts w:hint="default"/>
+      </w:rPr>
+    </w:lvl>
+    <w:lvl w:ilvl="3">
+      <w:start w:val="1"/>
+      <w:numFmt w:val="decimal"/>
+      <w:lvlText w:val="(%4)"/>
+      <w:lvlJc w:val="left"/>
+      <w:pPr>
+        <w:ind w:left="1440" w:hanging="360"/>
+      </w:pPr>
+      <w:rPr>
+        <w:rFonts w:hint="default"/>
+      </w:rPr>
+    </w:lvl>
+    <w:lvl w:ilvl="4">
+      <w:start w:val="1"/>
+      <w:numFmt w:val="lowerLetter"/>
+      <w:lvlText w:val="(%5)"/>
+      <w:lvlJc w:val="left"/>
+      <w:pPr>
+        <w:ind w:left="1800" w:hanging="360"/>
+      </w:pPr>
+      <w:rPr>
+        <w:rFonts w:hint="default"/>
+      </w:rPr>
+    </w:lvl>
+    <w:lvl w:ilvl="5">
+      <w:start w:val="1"/>
+      <w:numFmt w:val="lowerRoman"/>
+      <w:lvlText w:val="(%6)"/>
+      <w:lvlJc w:val="left"/>
+      <w:pPr>
+        <w:ind w:left="2160" w:hanging="360"/>
+      </w:pPr>
+      <w:rPr>
+        <w:rFonts w:hint="default"/>
+      </w:rPr>
+    </w:lvl>
+    <w:lvl w:ilvl="6">
+      <w:start w:val="1"/>
+      <w:numFmt w:val="decimal"/>
+      <w:lvlText w:val="%7."/>
+      <w:lvlJc w:val="left"/>
+      <w:pPr>
+        <w:ind w:left="2520" w:hanging="360"/>
+      </w:pPr>
+      <w:rPr>
+        <w:rFonts w:hint="default"/>
+      </w:rPr>
+    </w:lvl>
+    <w:lvl w:ilvl="7">
+      <w:start w:val="1"/>
+      <w:numFmt w:val="lowerLetter"/>
+      <w:lvlText w:val="%8."/>
+      <w:lvlJc w:val="left"/>
+      <w:pPr>
+        <w:ind w:left="2880" w:hanging="360"/>
+      </w:pPr>
+      <w:rPr>
+        <w:rFonts w:hint="default"/>
+      </w:rPr>
+    </w:lvl>
+    <w:lvl w:ilvl="8">
+      <w:start w:val="1"/>
+      <w:numFmt w:val="lowerRoman"/>
+      <w:lvlText w:val="%9."/>
+      <w:lvlJc w:val="left"/>
+      <w:pPr>
+        <w:ind w:left="3240" w:hanging="360"/>
+      </w:pPr>
+      <w:rPr>
+        <w:rFonts w:hint="default"/>
+      </w:rPr>
+    </w:lvl>
+  </w:abstractNum>
+  <w:abstractNum w:abstractNumId="7" w15:restartNumberingAfterBreak="0">
+    <w:nsid w:val="1705607A"/>
+    <w:multiLevelType w:val="multilevel"/>
+    <w:tmpl w:val="CFB4C6C4"/>
+    <w:lvl w:ilvl="0">
+      <w:start w:val="1"/>
+      <w:numFmt w:val="decimal"/>
+      <w:lvlText w:val="Week %1:"/>
+      <w:lvlJc w:val="left"/>
+      <w:pPr>
+        <w:ind w:left="360" w:hanging="360"/>
+      </w:pPr>
+      <w:rPr>
+        <w:rFonts w:hint="default"/>
+        <w:sz w:val="26"/>
+        <w:szCs w:val="26"/>
+      </w:rPr>
+    </w:lvl>
+    <w:lvl w:ilvl="1">
+      <w:start w:val="1"/>
+      <w:numFmt w:val="lowerLetter"/>
+      <w:lvlText w:val="%2."/>
+      <w:lvlJc w:val="left"/>
+      <w:pPr>
+        <w:ind w:left="720" w:hanging="360"/>
+      </w:pPr>
+      <w:rPr>
+        <w:rFonts w:hint="default"/>
+        <w:sz w:val="20"/>
+        <w:szCs w:val="20"/>
+      </w:rPr>
+    </w:lvl>
+    <w:lvl w:ilvl="2">
+      <w:start w:val="1"/>
+      <w:numFmt w:val="lowerRoman"/>
+      <w:lvlText w:val="%3)"/>
+      <w:lvlJc w:val="left"/>
+      <w:pPr>
+        <w:ind w:left="1080" w:hanging="360"/>
+      </w:pPr>
+      <w:rPr>
+        <w:rFonts w:hint="default"/>
+      </w:rPr>
+    </w:lvl>
+    <w:lvl w:ilvl="3">
+      <w:start w:val="1"/>
+      <w:numFmt w:val="decimal"/>
+      <w:lvlText w:val="(%4)"/>
+      <w:lvlJc w:val="left"/>
+      <w:pPr>
+        <w:ind w:left="1440" w:hanging="360"/>
+      </w:pPr>
+      <w:rPr>
+        <w:rFonts w:hint="default"/>
+      </w:rPr>
+    </w:lvl>
+    <w:lvl w:ilvl="4">
+      <w:start w:val="1"/>
+      <w:numFmt w:val="lowerLetter"/>
+      <w:lvlText w:val="(%5)"/>
+      <w:lvlJc w:val="left"/>
+      <w:pPr>
+        <w:ind w:left="1800" w:hanging="360"/>
+      </w:pPr>
+      <w:rPr>
+        <w:rFonts w:hint="default"/>
+      </w:rPr>
+    </w:lvl>
+    <w:lvl w:ilvl="5">
+      <w:start w:val="1"/>
+      <w:numFmt w:val="lowerRoman"/>
+      <w:lvlText w:val="(%6)"/>
+      <w:lvlJc w:val="left"/>
+      <w:pPr>
+        <w:ind w:left="2160" w:hanging="360"/>
+      </w:pPr>
+      <w:rPr>
+        <w:rFonts w:hint="default"/>
+      </w:rPr>
+    </w:lvl>
+    <w:lvl w:ilvl="6">
+      <w:start w:val="1"/>
+      <w:numFmt w:val="decimal"/>
+      <w:lvlText w:val="%7."/>
+      <w:lvlJc w:val="left"/>
+      <w:pPr>
+        <w:ind w:left="2520" w:hanging="360"/>
+      </w:pPr>
+      <w:rPr>
+        <w:rFonts w:hint="default"/>
+      </w:rPr>
+    </w:lvl>
+    <w:lvl w:ilvl="7">
+      <w:start w:val="1"/>
+      <w:numFmt w:val="lowerLetter"/>
+      <w:lvlText w:val="%8."/>
+      <w:lvlJc w:val="left"/>
+      <w:pPr>
+        <w:ind w:left="2880" w:hanging="360"/>
+      </w:pPr>
+      <w:rPr>
+        <w:rFonts w:hint="default"/>
+      </w:rPr>
+    </w:lvl>
+    <w:lvl w:ilvl="8">
+      <w:start w:val="1"/>
+      <w:numFmt w:val="lowerRoman"/>
+      <w:lvlText w:val="%9."/>
+      <w:lvlJc w:val="left"/>
+      <w:pPr>
+        <w:ind w:left="3240" w:hanging="360"/>
+      </w:pPr>
+      <w:rPr>
+        <w:rFonts w:hint="default"/>
+      </w:rPr>
+    </w:lvl>
+  </w:abstractNum>
+  <w:abstractNum w:abstractNumId="8" w15:restartNumberingAfterBreak="0">
     <w:nsid w:val="171A031A"/>
     <w:multiLevelType w:val="multilevel"/>
     <w:tmpl w:val="CFB4C6C4"/>
@@ -4448,7 +6400,388 @@
       </w:rPr>
     </w:lvl>
   </w:abstractNum>
-  <w:abstractNum w:abstractNumId="7" w15:restartNumberingAfterBreak="0">
+  <w:abstractNum w:abstractNumId="9" w15:restartNumberingAfterBreak="0">
+    <w:nsid w:val="194B0BF4"/>
+    <w:multiLevelType w:val="multilevel"/>
+    <w:tmpl w:val="C7A21964"/>
+    <w:lvl w:ilvl="0">
+      <w:start w:val="8"/>
+      <w:numFmt w:val="decimal"/>
+      <w:lvlText w:val="Week %1:"/>
+      <w:lvlJc w:val="left"/>
+      <w:pPr>
+        <w:ind w:left="360" w:hanging="360"/>
+      </w:pPr>
+      <w:rPr>
+        <w:rFonts w:hint="default"/>
+        <w:sz w:val="26"/>
+        <w:szCs w:val="26"/>
+      </w:rPr>
+    </w:lvl>
+    <w:lvl w:ilvl="1">
+      <w:start w:val="1"/>
+      <w:numFmt w:val="bullet"/>
+      <w:lvlText w:val=""/>
+      <w:lvlJc w:val="left"/>
+      <w:pPr>
+        <w:ind w:left="720" w:hanging="360"/>
+      </w:pPr>
+      <w:rPr>
+        <w:rFonts w:ascii="Symbol" w:hAnsi="Symbol" w:hint="default"/>
+      </w:rPr>
+    </w:lvl>
+    <w:lvl w:ilvl="2">
+      <w:start w:val="1"/>
+      <w:numFmt w:val="lowerRoman"/>
+      <w:lvlText w:val="%3)"/>
+      <w:lvlJc w:val="left"/>
+      <w:pPr>
+        <w:ind w:left="1080" w:hanging="360"/>
+      </w:pPr>
+      <w:rPr>
+        <w:rFonts w:hint="default"/>
+      </w:rPr>
+    </w:lvl>
+    <w:lvl w:ilvl="3">
+      <w:start w:val="1"/>
+      <w:numFmt w:val="decimal"/>
+      <w:lvlText w:val="(%4)"/>
+      <w:lvlJc w:val="left"/>
+      <w:pPr>
+        <w:ind w:left="1440" w:hanging="360"/>
+      </w:pPr>
+      <w:rPr>
+        <w:rFonts w:hint="default"/>
+      </w:rPr>
+    </w:lvl>
+    <w:lvl w:ilvl="4">
+      <w:start w:val="1"/>
+      <w:numFmt w:val="lowerLetter"/>
+      <w:lvlText w:val="(%5)"/>
+      <w:lvlJc w:val="left"/>
+      <w:pPr>
+        <w:ind w:left="1800" w:hanging="360"/>
+      </w:pPr>
+      <w:rPr>
+        <w:rFonts w:hint="default"/>
+      </w:rPr>
+    </w:lvl>
+    <w:lvl w:ilvl="5">
+      <w:start w:val="1"/>
+      <w:numFmt w:val="lowerRoman"/>
+      <w:lvlText w:val="(%6)"/>
+      <w:lvlJc w:val="left"/>
+      <w:pPr>
+        <w:ind w:left="2160" w:hanging="360"/>
+      </w:pPr>
+      <w:rPr>
+        <w:rFonts w:hint="default"/>
+      </w:rPr>
+    </w:lvl>
+    <w:lvl w:ilvl="6">
+      <w:start w:val="1"/>
+      <w:numFmt w:val="decimal"/>
+      <w:lvlText w:val="%7."/>
+      <w:lvlJc w:val="left"/>
+      <w:pPr>
+        <w:ind w:left="2520" w:hanging="360"/>
+      </w:pPr>
+      <w:rPr>
+        <w:rFonts w:hint="default"/>
+      </w:rPr>
+    </w:lvl>
+    <w:lvl w:ilvl="7">
+      <w:start w:val="1"/>
+      <w:numFmt w:val="lowerLetter"/>
+      <w:lvlText w:val="%8."/>
+      <w:lvlJc w:val="left"/>
+      <w:pPr>
+        <w:ind w:left="2880" w:hanging="360"/>
+      </w:pPr>
+      <w:rPr>
+        <w:rFonts w:hint="default"/>
+      </w:rPr>
+    </w:lvl>
+    <w:lvl w:ilvl="8">
+      <w:start w:val="1"/>
+      <w:numFmt w:val="lowerRoman"/>
+      <w:lvlText w:val="%9."/>
+      <w:lvlJc w:val="left"/>
+      <w:pPr>
+        <w:ind w:left="3240" w:hanging="360"/>
+      </w:pPr>
+      <w:rPr>
+        <w:rFonts w:hint="default"/>
+      </w:rPr>
+    </w:lvl>
+  </w:abstractNum>
+  <w:abstractNum w:abstractNumId="10" w15:restartNumberingAfterBreak="0">
+    <w:nsid w:val="1B8A4642"/>
+    <w:multiLevelType w:val="multilevel"/>
+    <w:tmpl w:val="CBB208C2"/>
+    <w:lvl w:ilvl="0">
+      <w:start w:val="1"/>
+      <w:numFmt w:val="decimal"/>
+      <w:lvlText w:val="Week %1:"/>
+      <w:lvlJc w:val="left"/>
+      <w:pPr>
+        <w:ind w:left="720" w:hanging="360"/>
+      </w:pPr>
+      <w:rPr>
+        <w:rFonts w:hint="default"/>
+        <w:sz w:val="26"/>
+        <w:szCs w:val="26"/>
+      </w:rPr>
+    </w:lvl>
+    <w:lvl w:ilvl="1">
+      <w:start w:val="1"/>
+      <w:numFmt w:val="lowerLetter"/>
+      <w:lvlText w:val="%2."/>
+      <w:lvlJc w:val="left"/>
+      <w:pPr>
+        <w:ind w:left="1080" w:hanging="360"/>
+      </w:pPr>
+      <w:rPr>
+        <w:rFonts w:hint="default"/>
+        <w:sz w:val="20"/>
+        <w:szCs w:val="20"/>
+      </w:rPr>
+    </w:lvl>
+    <w:lvl w:ilvl="2">
+      <w:start w:val="1"/>
+      <w:numFmt w:val="lowerRoman"/>
+      <w:lvlText w:val="%3)"/>
+      <w:lvlJc w:val="left"/>
+      <w:pPr>
+        <w:ind w:left="1440" w:hanging="360"/>
+      </w:pPr>
+      <w:rPr>
+        <w:rFonts w:hint="default"/>
+      </w:rPr>
+    </w:lvl>
+    <w:lvl w:ilvl="3">
+      <w:start w:val="1"/>
+      <w:numFmt w:val="decimal"/>
+      <w:lvlText w:val="(%4)"/>
+      <w:lvlJc w:val="left"/>
+      <w:pPr>
+        <w:ind w:left="1800" w:hanging="360"/>
+      </w:pPr>
+      <w:rPr>
+        <w:rFonts w:hint="default"/>
+      </w:rPr>
+    </w:lvl>
+    <w:lvl w:ilvl="4">
+      <w:start w:val="1"/>
+      <w:numFmt w:val="lowerLetter"/>
+      <w:lvlText w:val="(%5)"/>
+      <w:lvlJc w:val="left"/>
+      <w:pPr>
+        <w:ind w:left="2160" w:hanging="360"/>
+      </w:pPr>
+      <w:rPr>
+        <w:rFonts w:hint="default"/>
+      </w:rPr>
+    </w:lvl>
+    <w:lvl w:ilvl="5">
+      <w:start w:val="1"/>
+      <w:numFmt w:val="lowerRoman"/>
+      <w:lvlText w:val="(%6)"/>
+      <w:lvlJc w:val="left"/>
+      <w:pPr>
+        <w:ind w:left="2520" w:hanging="360"/>
+      </w:pPr>
+      <w:rPr>
+        <w:rFonts w:hint="default"/>
+      </w:rPr>
+    </w:lvl>
+    <w:lvl w:ilvl="6">
+      <w:start w:val="1"/>
+      <w:numFmt w:val="decimal"/>
+      <w:lvlText w:val="%7."/>
+      <w:lvlJc w:val="left"/>
+      <w:pPr>
+        <w:ind w:left="2880" w:hanging="360"/>
+      </w:pPr>
+      <w:rPr>
+        <w:rFonts w:hint="default"/>
+      </w:rPr>
+    </w:lvl>
+    <w:lvl w:ilvl="7">
+      <w:start w:val="1"/>
+      <w:numFmt w:val="lowerLetter"/>
+      <w:lvlText w:val="%8."/>
+      <w:lvlJc w:val="left"/>
+      <w:pPr>
+        <w:ind w:left="3240" w:hanging="360"/>
+      </w:pPr>
+      <w:rPr>
+        <w:rFonts w:hint="default"/>
+      </w:rPr>
+    </w:lvl>
+    <w:lvl w:ilvl="8">
+      <w:start w:val="1"/>
+      <w:numFmt w:val="lowerRoman"/>
+      <w:lvlText w:val="%9."/>
+      <w:lvlJc w:val="left"/>
+      <w:pPr>
+        <w:ind w:left="3600" w:hanging="360"/>
+      </w:pPr>
+      <w:rPr>
+        <w:rFonts w:hint="default"/>
+      </w:rPr>
+    </w:lvl>
+  </w:abstractNum>
+  <w:abstractNum w:abstractNumId="11" w15:restartNumberingAfterBreak="0">
+    <w:nsid w:val="1E7F1A28"/>
+    <w:multiLevelType w:val="multilevel"/>
+    <w:tmpl w:val="313ADE94"/>
+    <w:lvl w:ilvl="0">
+      <w:start w:val="1"/>
+      <w:numFmt w:val="bullet"/>
+      <w:lvlText w:val=""/>
+      <w:lvlJc w:val="left"/>
+      <w:pPr>
+        <w:tabs>
+          <w:tab w:val="num" w:pos="720"/>
+        </w:tabs>
+        <w:ind w:left="720" w:hanging="360"/>
+      </w:pPr>
+      <w:rPr>
+        <w:rFonts w:ascii="Symbol" w:hAnsi="Symbol" w:hint="default"/>
+        <w:sz w:val="20"/>
+      </w:rPr>
+    </w:lvl>
+    <w:lvl w:ilvl="1" w:tentative="1">
+      <w:start w:val="1"/>
+      <w:numFmt w:val="bullet"/>
+      <w:lvlText w:val="o"/>
+      <w:lvlJc w:val="left"/>
+      <w:pPr>
+        <w:tabs>
+          <w:tab w:val="num" w:pos="1440"/>
+        </w:tabs>
+        <w:ind w:left="1440" w:hanging="360"/>
+      </w:pPr>
+      <w:rPr>
+        <w:rFonts w:ascii="Courier New" w:hAnsi="Courier New" w:hint="default"/>
+        <w:sz w:val="20"/>
+      </w:rPr>
+    </w:lvl>
+    <w:lvl w:ilvl="2" w:tentative="1">
+      <w:start w:val="1"/>
+      <w:numFmt w:val="bullet"/>
+      <w:lvlText w:val=""/>
+      <w:lvlJc w:val="left"/>
+      <w:pPr>
+        <w:tabs>
+          <w:tab w:val="num" w:pos="2160"/>
+        </w:tabs>
+        <w:ind w:left="2160" w:hanging="360"/>
+      </w:pPr>
+      <w:rPr>
+        <w:rFonts w:ascii="Wingdings" w:hAnsi="Wingdings" w:hint="default"/>
+        <w:sz w:val="20"/>
+      </w:rPr>
+    </w:lvl>
+    <w:lvl w:ilvl="3" w:tentative="1">
+      <w:start w:val="1"/>
+      <w:numFmt w:val="bullet"/>
+      <w:lvlText w:val=""/>
+      <w:lvlJc w:val="left"/>
+      <w:pPr>
+        <w:tabs>
+          <w:tab w:val="num" w:pos="2880"/>
+        </w:tabs>
+        <w:ind w:left="2880" w:hanging="360"/>
+      </w:pPr>
+      <w:rPr>
+        <w:rFonts w:ascii="Wingdings" w:hAnsi="Wingdings" w:hint="default"/>
+        <w:sz w:val="20"/>
+      </w:rPr>
+    </w:lvl>
+    <w:lvl w:ilvl="4" w:tentative="1">
+      <w:start w:val="1"/>
+      <w:numFmt w:val="bullet"/>
+      <w:lvlText w:val=""/>
+      <w:lvlJc w:val="left"/>
+      <w:pPr>
+        <w:tabs>
+          <w:tab w:val="num" w:pos="3600"/>
+        </w:tabs>
+        <w:ind w:left="3600" w:hanging="360"/>
+      </w:pPr>
+      <w:rPr>
+        <w:rFonts w:ascii="Wingdings" w:hAnsi="Wingdings" w:hint="default"/>
+        <w:sz w:val="20"/>
+      </w:rPr>
+    </w:lvl>
+    <w:lvl w:ilvl="5" w:tentative="1">
+      <w:start w:val="1"/>
+      <w:numFmt w:val="bullet"/>
+      <w:lvlText w:val=""/>
+      <w:lvlJc w:val="left"/>
+      <w:pPr>
+        <w:tabs>
+          <w:tab w:val="num" w:pos="4320"/>
+        </w:tabs>
+        <w:ind w:left="4320" w:hanging="360"/>
+      </w:pPr>
+      <w:rPr>
+        <w:rFonts w:ascii="Wingdings" w:hAnsi="Wingdings" w:hint="default"/>
+        <w:sz w:val="20"/>
+      </w:rPr>
+    </w:lvl>
+    <w:lvl w:ilvl="6" w:tentative="1">
+      <w:start w:val="1"/>
+      <w:numFmt w:val="bullet"/>
+      <w:lvlText w:val=""/>
+      <w:lvlJc w:val="left"/>
+      <w:pPr>
+        <w:tabs>
+          <w:tab w:val="num" w:pos="5040"/>
+        </w:tabs>
+        <w:ind w:left="5040" w:hanging="360"/>
+      </w:pPr>
+      <w:rPr>
+        <w:rFonts w:ascii="Wingdings" w:hAnsi="Wingdings" w:hint="default"/>
+        <w:sz w:val="20"/>
+      </w:rPr>
+    </w:lvl>
+    <w:lvl w:ilvl="7" w:tentative="1">
+      <w:start w:val="1"/>
+      <w:numFmt w:val="bullet"/>
+      <w:lvlText w:val=""/>
+      <w:lvlJc w:val="left"/>
+      <w:pPr>
+        <w:tabs>
+          <w:tab w:val="num" w:pos="5760"/>
+        </w:tabs>
+        <w:ind w:left="5760" w:hanging="360"/>
+      </w:pPr>
+      <w:rPr>
+        <w:rFonts w:ascii="Wingdings" w:hAnsi="Wingdings" w:hint="default"/>
+        <w:sz w:val="20"/>
+      </w:rPr>
+    </w:lvl>
+    <w:lvl w:ilvl="8" w:tentative="1">
+      <w:start w:val="1"/>
+      <w:numFmt w:val="bullet"/>
+      <w:lvlText w:val=""/>
+      <w:lvlJc w:val="left"/>
+      <w:pPr>
+        <w:tabs>
+          <w:tab w:val="num" w:pos="6480"/>
+        </w:tabs>
+        <w:ind w:left="6480" w:hanging="360"/>
+      </w:pPr>
+      <w:rPr>
+        <w:rFonts w:ascii="Wingdings" w:hAnsi="Wingdings" w:hint="default"/>
+        <w:sz w:val="20"/>
+      </w:rPr>
+    </w:lvl>
+  </w:abstractNum>
+  <w:abstractNum w:abstractNumId="12" w15:restartNumberingAfterBreak="0">
     <w:nsid w:val="22705407"/>
     <w:multiLevelType w:val="multilevel"/>
     <w:tmpl w:val="CFB4C6C4"/>
@@ -4565,7 +6898,7 @@
       </w:rPr>
     </w:lvl>
   </w:abstractNum>
-  <w:abstractNum w:abstractNumId="8" w15:restartNumberingAfterBreak="0">
+  <w:abstractNum w:abstractNumId="13" w15:restartNumberingAfterBreak="0">
     <w:nsid w:val="24796F1A"/>
     <w:multiLevelType w:val="multilevel"/>
     <w:tmpl w:val="4009001D"/>
@@ -4651,7 +6984,7 @@
       </w:pPr>
     </w:lvl>
   </w:abstractNum>
-  <w:abstractNum w:abstractNumId="9" w15:restartNumberingAfterBreak="0">
+  <w:abstractNum w:abstractNumId="14" w15:restartNumberingAfterBreak="0">
     <w:nsid w:val="25736702"/>
     <w:multiLevelType w:val="hybridMultilevel"/>
     <w:tmpl w:val="32D43B86"/>
@@ -4763,7 +7096,7 @@
       </w:rPr>
     </w:lvl>
   </w:abstractNum>
-  <w:abstractNum w:abstractNumId="10" w15:restartNumberingAfterBreak="0">
+  <w:abstractNum w:abstractNumId="15" w15:restartNumberingAfterBreak="0">
     <w:nsid w:val="280C05E2"/>
     <w:multiLevelType w:val="multilevel"/>
     <w:tmpl w:val="4009001D"/>
@@ -4849,7 +7182,124 @@
       </w:pPr>
     </w:lvl>
   </w:abstractNum>
-  <w:abstractNum w:abstractNumId="11" w15:restartNumberingAfterBreak="0">
+  <w:abstractNum w:abstractNumId="16" w15:restartNumberingAfterBreak="0">
+    <w:nsid w:val="2A6F13E8"/>
+    <w:multiLevelType w:val="multilevel"/>
+    <w:tmpl w:val="CFB4C6C4"/>
+    <w:lvl w:ilvl="0">
+      <w:start w:val="1"/>
+      <w:numFmt w:val="decimal"/>
+      <w:lvlText w:val="Week %1:"/>
+      <w:lvlJc w:val="left"/>
+      <w:pPr>
+        <w:ind w:left="360" w:hanging="360"/>
+      </w:pPr>
+      <w:rPr>
+        <w:rFonts w:hint="default"/>
+        <w:sz w:val="26"/>
+        <w:szCs w:val="26"/>
+      </w:rPr>
+    </w:lvl>
+    <w:lvl w:ilvl="1">
+      <w:start w:val="1"/>
+      <w:numFmt w:val="lowerLetter"/>
+      <w:lvlText w:val="%2."/>
+      <w:lvlJc w:val="left"/>
+      <w:pPr>
+        <w:ind w:left="720" w:hanging="360"/>
+      </w:pPr>
+      <w:rPr>
+        <w:rFonts w:hint="default"/>
+        <w:sz w:val="20"/>
+        <w:szCs w:val="20"/>
+      </w:rPr>
+    </w:lvl>
+    <w:lvl w:ilvl="2">
+      <w:start w:val="1"/>
+      <w:numFmt w:val="lowerRoman"/>
+      <w:lvlText w:val="%3)"/>
+      <w:lvlJc w:val="left"/>
+      <w:pPr>
+        <w:ind w:left="1080" w:hanging="360"/>
+      </w:pPr>
+      <w:rPr>
+        <w:rFonts w:hint="default"/>
+      </w:rPr>
+    </w:lvl>
+    <w:lvl w:ilvl="3">
+      <w:start w:val="1"/>
+      <w:numFmt w:val="decimal"/>
+      <w:lvlText w:val="(%4)"/>
+      <w:lvlJc w:val="left"/>
+      <w:pPr>
+        <w:ind w:left="1440" w:hanging="360"/>
+      </w:pPr>
+      <w:rPr>
+        <w:rFonts w:hint="default"/>
+      </w:rPr>
+    </w:lvl>
+    <w:lvl w:ilvl="4">
+      <w:start w:val="1"/>
+      <w:numFmt w:val="lowerLetter"/>
+      <w:lvlText w:val="(%5)"/>
+      <w:lvlJc w:val="left"/>
+      <w:pPr>
+        <w:ind w:left="1800" w:hanging="360"/>
+      </w:pPr>
+      <w:rPr>
+        <w:rFonts w:hint="default"/>
+      </w:rPr>
+    </w:lvl>
+    <w:lvl w:ilvl="5">
+      <w:start w:val="1"/>
+      <w:numFmt w:val="lowerRoman"/>
+      <w:lvlText w:val="(%6)"/>
+      <w:lvlJc w:val="left"/>
+      <w:pPr>
+        <w:ind w:left="2160" w:hanging="360"/>
+      </w:pPr>
+      <w:rPr>
+        <w:rFonts w:hint="default"/>
+      </w:rPr>
+    </w:lvl>
+    <w:lvl w:ilvl="6">
+      <w:start w:val="1"/>
+      <w:numFmt w:val="decimal"/>
+      <w:lvlText w:val="%7."/>
+      <w:lvlJc w:val="left"/>
+      <w:pPr>
+        <w:ind w:left="2520" w:hanging="360"/>
+      </w:pPr>
+      <w:rPr>
+        <w:rFonts w:hint="default"/>
+      </w:rPr>
+    </w:lvl>
+    <w:lvl w:ilvl="7">
+      <w:start w:val="1"/>
+      <w:numFmt w:val="lowerLetter"/>
+      <w:lvlText w:val="%8."/>
+      <w:lvlJc w:val="left"/>
+      <w:pPr>
+        <w:ind w:left="2880" w:hanging="360"/>
+      </w:pPr>
+      <w:rPr>
+        <w:rFonts w:hint="default"/>
+      </w:rPr>
+    </w:lvl>
+    <w:lvl w:ilvl="8">
+      <w:start w:val="1"/>
+      <w:numFmt w:val="lowerRoman"/>
+      <w:lvlText w:val="%9."/>
+      <w:lvlJc w:val="left"/>
+      <w:pPr>
+        <w:ind w:left="3240" w:hanging="360"/>
+      </w:pPr>
+      <w:rPr>
+        <w:rFonts w:hint="default"/>
+      </w:rPr>
+    </w:lvl>
+  </w:abstractNum>
+  <w:abstractNum w:abstractNumId="17" w15:restartNumberingAfterBreak="0">
     <w:nsid w:val="2B731FA0"/>
     <w:multiLevelType w:val="multilevel"/>
     <w:tmpl w:val="0012FF3C"/>
@@ -4998,7 +7448,7 @@
       </w:rPr>
     </w:lvl>
   </w:abstractNum>
-  <w:abstractNum w:abstractNumId="12" w15:restartNumberingAfterBreak="0">
+  <w:abstractNum w:abstractNumId="18" w15:restartNumberingAfterBreak="0">
     <w:nsid w:val="32011BA9"/>
     <w:multiLevelType w:val="multilevel"/>
     <w:tmpl w:val="4009001D"/>
@@ -5084,7 +7534,7 @@
       </w:pPr>
     </w:lvl>
   </w:abstractNum>
-  <w:abstractNum w:abstractNumId="13" w15:restartNumberingAfterBreak="0">
+  <w:abstractNum w:abstractNumId="19" w15:restartNumberingAfterBreak="0">
     <w:nsid w:val="376559E3"/>
     <w:multiLevelType w:val="hybridMultilevel"/>
     <w:tmpl w:val="43A8EA60"/>
@@ -5170,7 +7620,7 @@
       </w:pPr>
     </w:lvl>
   </w:abstractNum>
-  <w:abstractNum w:abstractNumId="14" w15:restartNumberingAfterBreak="0">
+  <w:abstractNum w:abstractNumId="20" w15:restartNumberingAfterBreak="0">
     <w:nsid w:val="37823E13"/>
     <w:multiLevelType w:val="hybridMultilevel"/>
     <w:tmpl w:val="3A3C715A"/>
@@ -5283,7 +7733,124 @@
       </w:rPr>
     </w:lvl>
   </w:abstractNum>
-  <w:abstractNum w:abstractNumId="15" w15:restartNumberingAfterBreak="0">
+  <w:abstractNum w:abstractNumId="21" w15:restartNumberingAfterBreak="0">
+    <w:nsid w:val="39687A78"/>
+    <w:multiLevelType w:val="multilevel"/>
+    <w:tmpl w:val="CFB4C6C4"/>
+    <w:lvl w:ilvl="0">
+      <w:start w:val="1"/>
+      <w:numFmt w:val="decimal"/>
+      <w:lvlText w:val="Week %1:"/>
+      <w:lvlJc w:val="left"/>
+      <w:pPr>
+        <w:ind w:left="360" w:hanging="360"/>
+      </w:pPr>
+      <w:rPr>
+        <w:rFonts w:hint="default"/>
+        <w:sz w:val="26"/>
+        <w:szCs w:val="26"/>
+      </w:rPr>
+    </w:lvl>
+    <w:lvl w:ilvl="1">
+      <w:start w:val="1"/>
+      <w:numFmt w:val="lowerLetter"/>
+      <w:lvlText w:val="%2."/>
+      <w:lvlJc w:val="left"/>
+      <w:pPr>
+        <w:ind w:left="720" w:hanging="360"/>
+      </w:pPr>
+      <w:rPr>
+        <w:rFonts w:hint="default"/>
+        <w:sz w:val="20"/>
+        <w:szCs w:val="20"/>
+      </w:rPr>
+    </w:lvl>
+    <w:lvl w:ilvl="2">
+      <w:start w:val="1"/>
+      <w:numFmt w:val="lowerRoman"/>
+      <w:lvlText w:val="%3)"/>
+      <w:lvlJc w:val="left"/>
+      <w:pPr>
+        <w:ind w:left="1080" w:hanging="360"/>
+      </w:pPr>
+      <w:rPr>
+        <w:rFonts w:hint="default"/>
+      </w:rPr>
+    </w:lvl>
+    <w:lvl w:ilvl="3">
+      <w:start w:val="1"/>
+      <w:numFmt w:val="decimal"/>
+      <w:lvlText w:val="(%4)"/>
+      <w:lvlJc w:val="left"/>
+      <w:pPr>
+        <w:ind w:left="1440" w:hanging="360"/>
+      </w:pPr>
+      <w:rPr>
+        <w:rFonts w:hint="default"/>
+      </w:rPr>
+    </w:lvl>
+    <w:lvl w:ilvl="4">
+      <w:start w:val="1"/>
+      <w:numFmt w:val="lowerLetter"/>
+      <w:lvlText w:val="(%5)"/>
+      <w:lvlJc w:val="left"/>
+      <w:pPr>
+        <w:ind w:left="1800" w:hanging="360"/>
+      </w:pPr>
+      <w:rPr>
+        <w:rFonts w:hint="default"/>
+      </w:rPr>
+    </w:lvl>
+    <w:lvl w:ilvl="5">
+      <w:start w:val="1"/>
+      <w:numFmt w:val="lowerRoman"/>
+      <w:lvlText w:val="(%6)"/>
+      <w:lvlJc w:val="left"/>
+      <w:pPr>
+        <w:ind w:left="2160" w:hanging="360"/>
+      </w:pPr>
+      <w:rPr>
+        <w:rFonts w:hint="default"/>
+      </w:rPr>
+    </w:lvl>
+    <w:lvl w:ilvl="6">
+      <w:start w:val="1"/>
+      <w:numFmt w:val="decimal"/>
+      <w:lvlText w:val="%7."/>
+      <w:lvlJc w:val="left"/>
+      <w:pPr>
+        <w:ind w:left="2520" w:hanging="360"/>
+      </w:pPr>
+      <w:rPr>
+        <w:rFonts w:hint="default"/>
+      </w:rPr>
+    </w:lvl>
+    <w:lvl w:ilvl="7">
+      <w:start w:val="1"/>
+      <w:numFmt w:val="lowerLetter"/>
+      <w:lvlText w:val="%8."/>
+      <w:lvlJc w:val="left"/>
+      <w:pPr>
+        <w:ind w:left="2880" w:hanging="360"/>
+      </w:pPr>
+      <w:rPr>
+        <w:rFonts w:hint="default"/>
+      </w:rPr>
+    </w:lvl>
+    <w:lvl w:ilvl="8">
+      <w:start w:val="1"/>
+      <w:numFmt w:val="lowerRoman"/>
+      <w:lvlText w:val="%9."/>
+      <w:lvlJc w:val="left"/>
+      <w:pPr>
+        <w:ind w:left="3240" w:hanging="360"/>
+      </w:pPr>
+      <w:rPr>
+        <w:rFonts w:hint="default"/>
+      </w:rPr>
+    </w:lvl>
+  </w:abstractNum>
+  <w:abstractNum w:abstractNumId="22" w15:restartNumberingAfterBreak="0">
     <w:nsid w:val="3A4D5B0C"/>
     <w:multiLevelType w:val="hybridMultilevel"/>
     <w:tmpl w:val="F0F6C362"/>
@@ -5396,7 +7963,156 @@
       </w:rPr>
     </w:lvl>
   </w:abstractNum>
-  <w:abstractNum w:abstractNumId="16" w15:restartNumberingAfterBreak="0">
+  <w:abstractNum w:abstractNumId="23" w15:restartNumberingAfterBreak="0">
+    <w:nsid w:val="3B945A69"/>
+    <w:multiLevelType w:val="multilevel"/>
+    <w:tmpl w:val="629A1572"/>
+    <w:lvl w:ilvl="0">
+      <w:start w:val="1"/>
+      <w:numFmt w:val="bullet"/>
+      <w:lvlText w:val=""/>
+      <w:lvlJc w:val="left"/>
+      <w:pPr>
+        <w:tabs>
+          <w:tab w:val="num" w:pos="720"/>
+        </w:tabs>
+        <w:ind w:left="720" w:hanging="360"/>
+      </w:pPr>
+      <w:rPr>
+        <w:rFonts w:ascii="Symbol" w:hAnsi="Symbol" w:hint="default"/>
+        <w:sz w:val="20"/>
+      </w:rPr>
+    </w:lvl>
+    <w:lvl w:ilvl="1" w:tentative="1">
+      <w:start w:val="1"/>
+      <w:numFmt w:val="bullet"/>
+      <w:lvlText w:val="o"/>
+      <w:lvlJc w:val="left"/>
+      <w:pPr>
+        <w:tabs>
+          <w:tab w:val="num" w:pos="1440"/>
+        </w:tabs>
+        <w:ind w:left="1440" w:hanging="360"/>
+      </w:pPr>
+      <w:rPr>
+        <w:rFonts w:ascii="Courier New" w:hAnsi="Courier New" w:hint="default"/>
+        <w:sz w:val="20"/>
+      </w:rPr>
+    </w:lvl>
+    <w:lvl w:ilvl="2" w:tentative="1">
+      <w:start w:val="1"/>
+      <w:numFmt w:val="bullet"/>
+      <w:lvlText w:val=""/>
+      <w:lvlJc w:val="left"/>
+      <w:pPr>
+        <w:tabs>
+          <w:tab w:val="num" w:pos="2160"/>
+        </w:tabs>
+        <w:ind w:left="2160" w:hanging="360"/>
+      </w:pPr>
+      <w:rPr>
+        <w:rFonts w:ascii="Wingdings" w:hAnsi="Wingdings" w:hint="default"/>
+        <w:sz w:val="20"/>
+      </w:rPr>
+    </w:lvl>
+    <w:lvl w:ilvl="3" w:tentative="1">
+      <w:start w:val="1"/>
+      <w:numFmt w:val="bullet"/>
+      <w:lvlText w:val=""/>
+      <w:lvlJc w:val="left"/>
+      <w:pPr>
+        <w:tabs>
+          <w:tab w:val="num" w:pos="2880"/>
+        </w:tabs>
+        <w:ind w:left="2880" w:hanging="360"/>
+      </w:pPr>
+      <w:rPr>
+        <w:rFonts w:ascii="Wingdings" w:hAnsi="Wingdings" w:hint="default"/>
+        <w:sz w:val="20"/>
+      </w:rPr>
+    </w:lvl>
+    <w:lvl w:ilvl="4" w:tentative="1">
+      <w:start w:val="1"/>
+      <w:numFmt w:val="bullet"/>
+      <w:lvlText w:val=""/>
+      <w:lvlJc w:val="left"/>
+      <w:pPr>
+        <w:tabs>
+          <w:tab w:val="num" w:pos="3600"/>
+        </w:tabs>
+        <w:ind w:left="3600" w:hanging="360"/>
+      </w:pPr>
+      <w:rPr>
+        <w:rFonts w:ascii="Wingdings" w:hAnsi="Wingdings" w:hint="default"/>
+        <w:sz w:val="20"/>
+      </w:rPr>
+    </w:lvl>
+    <w:lvl w:ilvl="5" w:tentative="1">
+      <w:start w:val="1"/>
+      <w:numFmt w:val="bullet"/>
+      <w:lvlText w:val=""/>
+      <w:lvlJc w:val="left"/>
+      <w:pPr>
+        <w:tabs>
+          <w:tab w:val="num" w:pos="4320"/>
+        </w:tabs>
+        <w:ind w:left="4320" w:hanging="360"/>
+      </w:pPr>
+      <w:rPr>
+        <w:rFonts w:ascii="Wingdings" w:hAnsi="Wingdings" w:hint="default"/>
+        <w:sz w:val="20"/>
+      </w:rPr>
+    </w:lvl>
+    <w:lvl w:ilvl="6" w:tentative="1">
+      <w:start w:val="1"/>
+      <w:numFmt w:val="bullet"/>
+      <w:lvlText w:val=""/>
+      <w:lvlJc w:val="left"/>
+      <w:pPr>
+        <w:tabs>
+          <w:tab w:val="num" w:pos="5040"/>
+        </w:tabs>
+        <w:ind w:left="5040" w:hanging="360"/>
+      </w:pPr>
+      <w:rPr>
+        <w:rFonts w:ascii="Wingdings" w:hAnsi="Wingdings" w:hint="default"/>
+        <w:sz w:val="20"/>
+      </w:rPr>
+    </w:lvl>
+    <w:lvl w:ilvl="7" w:tentative="1">
+      <w:start w:val="1"/>
+      <w:numFmt w:val="bullet"/>
+      <w:lvlText w:val=""/>
+      <w:lvlJc w:val="left"/>
+      <w:pPr>
+        <w:tabs>
+          <w:tab w:val="num" w:pos="5760"/>
+        </w:tabs>
+        <w:ind w:left="5760" w:hanging="360"/>
+      </w:pPr>
+      <w:rPr>
+        <w:rFonts w:ascii="Wingdings" w:hAnsi="Wingdings" w:hint="default"/>
+        <w:sz w:val="20"/>
+      </w:rPr>
+    </w:lvl>
+    <w:lvl w:ilvl="8" w:tentative="1">
+      <w:start w:val="1"/>
+      <w:numFmt w:val="bullet"/>
+      <w:lvlText w:val=""/>
+      <w:lvlJc w:val="left"/>
+      <w:pPr>
+        <w:tabs>
+          <w:tab w:val="num" w:pos="6480"/>
+        </w:tabs>
+        <w:ind w:left="6480" w:hanging="360"/>
+      </w:pPr>
+      <w:rPr>
+        <w:rFonts w:ascii="Wingdings" w:hAnsi="Wingdings" w:hint="default"/>
+        <w:sz w:val="20"/>
+      </w:rPr>
+    </w:lvl>
+  </w:abstractNum>
+  <w:abstractNum w:abstractNumId="24" w15:restartNumberingAfterBreak="0">
     <w:nsid w:val="3C414492"/>
     <w:multiLevelType w:val="hybridMultilevel"/>
     <w:tmpl w:val="D452CC6A"/>
@@ -5509,7 +8225,156 @@
       </w:rPr>
     </w:lvl>
   </w:abstractNum>
-  <w:abstractNum w:abstractNumId="17" w15:restartNumberingAfterBreak="0">
+  <w:abstractNum w:abstractNumId="25" w15:restartNumberingAfterBreak="0">
+    <w:nsid w:val="3DDE340E"/>
+    <w:multiLevelType w:val="multilevel"/>
+    <w:tmpl w:val="8B56F7A4"/>
+    <w:lvl w:ilvl="0">
+      <w:start w:val="1"/>
+      <w:numFmt w:val="bullet"/>
+      <w:lvlText w:val=""/>
+      <w:lvlJc w:val="left"/>
+      <w:pPr>
+        <w:tabs>
+          <w:tab w:val="num" w:pos="720"/>
+        </w:tabs>
+        <w:ind w:left="720" w:hanging="360"/>
+      </w:pPr>
+      <w:rPr>
+        <w:rFonts w:ascii="Symbol" w:hAnsi="Symbol" w:hint="default"/>
+        <w:sz w:val="20"/>
+      </w:rPr>
+    </w:lvl>
+    <w:lvl w:ilvl="1" w:tentative="1">
+      <w:start w:val="1"/>
+      <w:numFmt w:val="bullet"/>
+      <w:lvlText w:val="o"/>
+      <w:lvlJc w:val="left"/>
+      <w:pPr>
+        <w:tabs>
+          <w:tab w:val="num" w:pos="1440"/>
+        </w:tabs>
+        <w:ind w:left="1440" w:hanging="360"/>
+      </w:pPr>
+      <w:rPr>
+        <w:rFonts w:ascii="Courier New" w:hAnsi="Courier New" w:hint="default"/>
+        <w:sz w:val="20"/>
+      </w:rPr>
+    </w:lvl>
+    <w:lvl w:ilvl="2" w:tentative="1">
+      <w:start w:val="1"/>
+      <w:numFmt w:val="bullet"/>
+      <w:lvlText w:val=""/>
+      <w:lvlJc w:val="left"/>
+      <w:pPr>
+        <w:tabs>
+          <w:tab w:val="num" w:pos="2160"/>
+        </w:tabs>
+        <w:ind w:left="2160" w:hanging="360"/>
+      </w:pPr>
+      <w:rPr>
+        <w:rFonts w:ascii="Wingdings" w:hAnsi="Wingdings" w:hint="default"/>
+        <w:sz w:val="20"/>
+      </w:rPr>
+    </w:lvl>
+    <w:lvl w:ilvl="3" w:tentative="1">
+      <w:start w:val="1"/>
+      <w:numFmt w:val="bullet"/>
+      <w:lvlText w:val=""/>
+      <w:lvlJc w:val="left"/>
+      <w:pPr>
+        <w:tabs>
+          <w:tab w:val="num" w:pos="2880"/>
+        </w:tabs>
+        <w:ind w:left="2880" w:hanging="360"/>
+      </w:pPr>
+      <w:rPr>
+        <w:rFonts w:ascii="Wingdings" w:hAnsi="Wingdings" w:hint="default"/>
+        <w:sz w:val="20"/>
+      </w:rPr>
+    </w:lvl>
+    <w:lvl w:ilvl="4" w:tentative="1">
+      <w:start w:val="1"/>
+      <w:numFmt w:val="bullet"/>
+      <w:lvlText w:val=""/>
+      <w:lvlJc w:val="left"/>
+      <w:pPr>
+        <w:tabs>
+          <w:tab w:val="num" w:pos="3600"/>
+        </w:tabs>
+        <w:ind w:left="3600" w:hanging="360"/>
+      </w:pPr>
+      <w:rPr>
+        <w:rFonts w:ascii="Wingdings" w:hAnsi="Wingdings" w:hint="default"/>
+        <w:sz w:val="20"/>
+      </w:rPr>
+    </w:lvl>
+    <w:lvl w:ilvl="5" w:tentative="1">
+      <w:start w:val="1"/>
+      <w:numFmt w:val="bullet"/>
+      <w:lvlText w:val=""/>
+      <w:lvlJc w:val="left"/>
+      <w:pPr>
+        <w:tabs>
+          <w:tab w:val="num" w:pos="4320"/>
+        </w:tabs>
+        <w:ind w:left="4320" w:hanging="360"/>
+      </w:pPr>
+      <w:rPr>
+        <w:rFonts w:ascii="Wingdings" w:hAnsi="Wingdings" w:hint="default"/>
+        <w:sz w:val="20"/>
+      </w:rPr>
+    </w:lvl>
+    <w:lvl w:ilvl="6" w:tentative="1">
+      <w:start w:val="1"/>
+      <w:numFmt w:val="bullet"/>
+      <w:lvlText w:val=""/>
+      <w:lvlJc w:val="left"/>
+      <w:pPr>
+        <w:tabs>
+          <w:tab w:val="num" w:pos="5040"/>
+        </w:tabs>
+        <w:ind w:left="5040" w:hanging="360"/>
+      </w:pPr>
+      <w:rPr>
+        <w:rFonts w:ascii="Wingdings" w:hAnsi="Wingdings" w:hint="default"/>
+        <w:sz w:val="20"/>
+      </w:rPr>
+    </w:lvl>
+    <w:lvl w:ilvl="7" w:tentative="1">
+      <w:start w:val="1"/>
+      <w:numFmt w:val="bullet"/>
+      <w:lvlText w:val=""/>
+      <w:lvlJc w:val="left"/>
+      <w:pPr>
+        <w:tabs>
+          <w:tab w:val="num" w:pos="5760"/>
+        </w:tabs>
+        <w:ind w:left="5760" w:hanging="360"/>
+      </w:pPr>
+      <w:rPr>
+        <w:rFonts w:ascii="Wingdings" w:hAnsi="Wingdings" w:hint="default"/>
+        <w:sz w:val="20"/>
+      </w:rPr>
+    </w:lvl>
+    <w:lvl w:ilvl="8" w:tentative="1">
+      <w:start w:val="1"/>
+      <w:numFmt w:val="bullet"/>
+      <w:lvlText w:val=""/>
+      <w:lvlJc w:val="left"/>
+      <w:pPr>
+        <w:tabs>
+          <w:tab w:val="num" w:pos="6480"/>
+        </w:tabs>
+        <w:ind w:left="6480" w:hanging="360"/>
+      </w:pPr>
+      <w:rPr>
+        <w:rFonts w:ascii="Wingdings" w:hAnsi="Wingdings" w:hint="default"/>
+        <w:sz w:val="20"/>
+      </w:rPr>
+    </w:lvl>
+  </w:abstractNum>
+  <w:abstractNum w:abstractNumId="26" w15:restartNumberingAfterBreak="0">
     <w:nsid w:val="42EF0688"/>
     <w:multiLevelType w:val="multilevel"/>
     <w:tmpl w:val="CFB4C6C4"/>
@@ -5626,7 +8491,120 @@
       </w:rPr>
     </w:lvl>
   </w:abstractNum>
-  <w:abstractNum w:abstractNumId="18" w15:restartNumberingAfterBreak="0">
+  <w:abstractNum w:abstractNumId="27" w15:restartNumberingAfterBreak="0">
+    <w:nsid w:val="44385B56"/>
+    <w:multiLevelType w:val="hybridMultilevel"/>
+    <w:tmpl w:val="84949EEE"/>
+    <w:lvl w:ilvl="0" w:tplc="40090001">
+      <w:start w:val="1"/>
+      <w:numFmt w:val="bullet"/>
+      <w:lvlText w:val=""/>
+      <w:lvlJc w:val="left"/>
+      <w:pPr>
+        <w:ind w:left="1800" w:hanging="360"/>
+      </w:pPr>
+      <w:rPr>
+        <w:rFonts w:ascii="Symbol" w:hAnsi="Symbol" w:hint="default"/>
+      </w:rPr>
+    </w:lvl>
+    <w:lvl w:ilvl="1" w:tplc="40090003" w:tentative="1">
+      <w:start w:val="1"/>
+      <w:numFmt w:val="bullet"/>
+      <w:lvlText w:val="o"/>
+      <w:lvlJc w:val="left"/>
+      <w:pPr>
+        <w:ind w:left="2520" w:hanging="360"/>
+      </w:pPr>
+      <w:rPr>
+        <w:rFonts w:ascii="Courier New" w:hAnsi="Courier New" w:cs="Courier New" w:hint="default"/>
+      </w:rPr>
+    </w:lvl>
+    <w:lvl w:ilvl="2" w:tplc="40090005" w:tentative="1">
+      <w:start w:val="1"/>
+      <w:numFmt w:val="bullet"/>
+      <w:lvlText w:val=""/>
+      <w:lvlJc w:val="left"/>
+      <w:pPr>
+        <w:ind w:left="3240" w:hanging="360"/>
+      </w:pPr>
+      <w:rPr>
+        <w:rFonts w:ascii="Wingdings" w:hAnsi="Wingdings" w:hint="default"/>
+      </w:rPr>
+    </w:lvl>
+    <w:lvl w:ilvl="3" w:tplc="40090001" w:tentative="1">
+      <w:start w:val="1"/>
+      <w:numFmt w:val="bullet"/>
+      <w:lvlText w:val=""/>
+      <w:lvlJc w:val="left"/>
+      <w:pPr>
+        <w:ind w:left="3960" w:hanging="360"/>
+      </w:pPr>
+      <w:rPr>
+        <w:rFonts w:ascii="Symbol" w:hAnsi="Symbol" w:hint="default"/>
+      </w:rPr>
+    </w:lvl>
+    <w:lvl w:ilvl="4" w:tplc="40090003" w:tentative="1">
+      <w:start w:val="1"/>
+      <w:numFmt w:val="bullet"/>
+      <w:lvlText w:val="o"/>
+      <w:lvlJc w:val="left"/>
+      <w:pPr>
+        <w:ind w:left="4680" w:hanging="360"/>
+      </w:pPr>
+      <w:rPr>
+        <w:rFonts w:ascii="Courier New" w:hAnsi="Courier New" w:cs="Courier New" w:hint="default"/>
+      </w:rPr>
+    </w:lvl>
+    <w:lvl w:ilvl="5" w:tplc="40090005" w:tentative="1">
+      <w:start w:val="1"/>
+      <w:numFmt w:val="bullet"/>
+      <w:lvlText w:val=""/>
+      <w:lvlJc w:val="left"/>
+      <w:pPr>
+        <w:ind w:left="5400" w:hanging="360"/>
+      </w:pPr>
+      <w:rPr>
+        <w:rFonts w:ascii="Wingdings" w:hAnsi="Wingdings" w:hint="default"/>
+      </w:rPr>
+    </w:lvl>
+    <w:lvl w:ilvl="6" w:tplc="40090001" w:tentative="1">
+      <w:start w:val="1"/>
+      <w:numFmt w:val="bullet"/>
+      <w:lvlText w:val=""/>
+      <w:lvlJc w:val="left"/>
+      <w:pPr>
+        <w:ind w:left="6120" w:hanging="360"/>
+      </w:pPr>
+      <w:rPr>
+        <w:rFonts w:ascii="Symbol" w:hAnsi="Symbol" w:hint="default"/>
+      </w:rPr>
+    </w:lvl>
+    <w:lvl w:ilvl="7" w:tplc="40090003" w:tentative="1">
+      <w:start w:val="1"/>
+      <w:numFmt w:val="bullet"/>
+      <w:lvlText w:val="o"/>
+      <w:lvlJc w:val="left"/>
+      <w:pPr>
+        <w:ind w:left="6840" w:hanging="360"/>
+      </w:pPr>
+      <w:rPr>
+        <w:rFonts w:ascii="Courier New" w:hAnsi="Courier New" w:cs="Courier New" w:hint="default"/>
+      </w:rPr>
+    </w:lvl>
+    <w:lvl w:ilvl="8" w:tplc="40090005" w:tentative="1">
+      <w:start w:val="1"/>
+      <w:numFmt w:val="bullet"/>
+      <w:lvlText w:val=""/>
+      <w:lvlJc w:val="left"/>
+      <w:pPr>
+        <w:ind w:left="7560" w:hanging="360"/>
+      </w:pPr>
+      <w:rPr>
+        <w:rFonts w:ascii="Wingdings" w:hAnsi="Wingdings" w:hint="default"/>
+      </w:rPr>
+    </w:lvl>
+  </w:abstractNum>
+  <w:abstractNum w:abstractNumId="28" w15:restartNumberingAfterBreak="0">
     <w:nsid w:val="447D3562"/>
     <w:multiLevelType w:val="hybridMultilevel"/>
     <w:tmpl w:val="2C12389A"/>
@@ -5738,7 +8716,7 @@
       </w:rPr>
     </w:lvl>
   </w:abstractNum>
-  <w:abstractNum w:abstractNumId="19" w15:restartNumberingAfterBreak="0">
+  <w:abstractNum w:abstractNumId="29" w15:restartNumberingAfterBreak="0">
     <w:nsid w:val="47107DBC"/>
     <w:multiLevelType w:val="hybridMultilevel"/>
     <w:tmpl w:val="6240B50C"/>
@@ -5824,7 +8802,7 @@
       </w:pPr>
     </w:lvl>
   </w:abstractNum>
-  <w:abstractNum w:abstractNumId="20" w15:restartNumberingAfterBreak="0">
+  <w:abstractNum w:abstractNumId="30" w15:restartNumberingAfterBreak="0">
     <w:nsid w:val="4A7F2799"/>
     <w:multiLevelType w:val="multilevel"/>
     <w:tmpl w:val="CFB4C6C4"/>
@@ -5941,7 +8919,124 @@
       </w:rPr>
     </w:lvl>
   </w:abstractNum>
-  <w:abstractNum w:abstractNumId="21" w15:restartNumberingAfterBreak="0">
+  <w:abstractNum w:abstractNumId="31" w15:restartNumberingAfterBreak="0">
+    <w:nsid w:val="4C354C5F"/>
+    <w:multiLevelType w:val="multilevel"/>
+    <w:tmpl w:val="CFB4C6C4"/>
+    <w:lvl w:ilvl="0">
+      <w:start w:val="1"/>
+      <w:numFmt w:val="decimal"/>
+      <w:lvlText w:val="Week %1:"/>
+      <w:lvlJc w:val="left"/>
+      <w:pPr>
+        <w:ind w:left="360" w:hanging="360"/>
+      </w:pPr>
+      <w:rPr>
+        <w:rFonts w:hint="default"/>
+        <w:sz w:val="26"/>
+        <w:szCs w:val="26"/>
+      </w:rPr>
+    </w:lvl>
+    <w:lvl w:ilvl="1">
+      <w:start w:val="1"/>
+      <w:numFmt w:val="lowerLetter"/>
+      <w:lvlText w:val="%2."/>
+      <w:lvlJc w:val="left"/>
+      <w:pPr>
+        <w:ind w:left="720" w:hanging="360"/>
+      </w:pPr>
+      <w:rPr>
+        <w:rFonts w:hint="default"/>
+        <w:sz w:val="20"/>
+        <w:szCs w:val="20"/>
+      </w:rPr>
+    </w:lvl>
+    <w:lvl w:ilvl="2">
+      <w:start w:val="1"/>
+      <w:numFmt w:val="lowerRoman"/>
+      <w:lvlText w:val="%3)"/>
+      <w:lvlJc w:val="left"/>
+      <w:pPr>
+        <w:ind w:left="1080" w:hanging="360"/>
+      </w:pPr>
+      <w:rPr>
+        <w:rFonts w:hint="default"/>
+      </w:rPr>
+    </w:lvl>
+    <w:lvl w:ilvl="3">
+      <w:start w:val="1"/>
+      <w:numFmt w:val="decimal"/>
+      <w:lvlText w:val="(%4)"/>
+      <w:lvlJc w:val="left"/>
+      <w:pPr>
+        <w:ind w:left="1440" w:hanging="360"/>
+      </w:pPr>
+      <w:rPr>
+        <w:rFonts w:hint="default"/>
+      </w:rPr>
+    </w:lvl>
+    <w:lvl w:ilvl="4">
+      <w:start w:val="1"/>
+      <w:numFmt w:val="lowerLetter"/>
+      <w:lvlText w:val="(%5)"/>
+      <w:lvlJc w:val="left"/>
+      <w:pPr>
+        <w:ind w:left="1800" w:hanging="360"/>
+      </w:pPr>
+      <w:rPr>
+        <w:rFonts w:hint="default"/>
+      </w:rPr>
+    </w:lvl>
+    <w:lvl w:ilvl="5">
+      <w:start w:val="1"/>
+      <w:numFmt w:val="lowerRoman"/>
+      <w:lvlText w:val="(%6)"/>
+      <w:lvlJc w:val="left"/>
+      <w:pPr>
+        <w:ind w:left="2160" w:hanging="360"/>
+      </w:pPr>
+      <w:rPr>
+        <w:rFonts w:hint="default"/>
+      </w:rPr>
+    </w:lvl>
+    <w:lvl w:ilvl="6">
+      <w:start w:val="1"/>
+      <w:numFmt w:val="decimal"/>
+      <w:lvlText w:val="%7."/>
+      <w:lvlJc w:val="left"/>
+      <w:pPr>
+        <w:ind w:left="2520" w:hanging="360"/>
+      </w:pPr>
+      <w:rPr>
+        <w:rFonts w:hint="default"/>
+      </w:rPr>
+    </w:lvl>
+    <w:lvl w:ilvl="7">
+      <w:start w:val="1"/>
+      <w:numFmt w:val="lowerLetter"/>
+      <w:lvlText w:val="%8."/>
+      <w:lvlJc w:val="left"/>
+      <w:pPr>
+        <w:ind w:left="2880" w:hanging="360"/>
+      </w:pPr>
+      <w:rPr>
+        <w:rFonts w:hint="default"/>
+      </w:rPr>
+    </w:lvl>
+    <w:lvl w:ilvl="8">
+      <w:start w:val="1"/>
+      <w:numFmt w:val="lowerRoman"/>
+      <w:lvlText w:val="%9."/>
+      <w:lvlJc w:val="left"/>
+      <w:pPr>
+        <w:ind w:left="3240" w:hanging="360"/>
+      </w:pPr>
+      <w:rPr>
+        <w:rFonts w:hint="default"/>
+      </w:rPr>
+    </w:lvl>
+  </w:abstractNum>
+  <w:abstractNum w:abstractNumId="32" w15:restartNumberingAfterBreak="0">
     <w:nsid w:val="4F73427F"/>
     <w:multiLevelType w:val="multilevel"/>
     <w:tmpl w:val="A282EBB2"/>
@@ -6090,7 +9185,7 @@
       </w:rPr>
     </w:lvl>
   </w:abstractNum>
-  <w:abstractNum w:abstractNumId="22" w15:restartNumberingAfterBreak="0">
+  <w:abstractNum w:abstractNumId="33" w15:restartNumberingAfterBreak="0">
     <w:nsid w:val="50964278"/>
     <w:multiLevelType w:val="hybridMultilevel"/>
     <w:tmpl w:val="396C56C0"/>
@@ -6202,7 +9297,269 @@
       </w:rPr>
     </w:lvl>
   </w:abstractNum>
-  <w:abstractNum w:abstractNumId="23" w15:restartNumberingAfterBreak="0">
+  <w:abstractNum w:abstractNumId="34" w15:restartNumberingAfterBreak="0">
+    <w:nsid w:val="51212E2C"/>
+    <w:multiLevelType w:val="multilevel"/>
+    <w:tmpl w:val="0832D6B2"/>
+    <w:lvl w:ilvl="0">
+      <w:start w:val="1"/>
+      <w:numFmt w:val="bullet"/>
+      <w:lvlText w:val=""/>
+      <w:lvlJc w:val="left"/>
+      <w:pPr>
+        <w:tabs>
+          <w:tab w:val="num" w:pos="720"/>
+        </w:tabs>
+        <w:ind w:left="720" w:hanging="360"/>
+      </w:pPr>
+      <w:rPr>
+        <w:rFonts w:ascii="Symbol" w:hAnsi="Symbol" w:hint="default"/>
+        <w:sz w:val="20"/>
+      </w:rPr>
+    </w:lvl>
+    <w:lvl w:ilvl="1" w:tentative="1">
+      <w:start w:val="1"/>
+      <w:numFmt w:val="bullet"/>
+      <w:lvlText w:val="o"/>
+      <w:lvlJc w:val="left"/>
+      <w:pPr>
+        <w:tabs>
+          <w:tab w:val="num" w:pos="1440"/>
+        </w:tabs>
+        <w:ind w:left="1440" w:hanging="360"/>
+      </w:pPr>
+      <w:rPr>
+        <w:rFonts w:ascii="Courier New" w:hAnsi="Courier New" w:hint="default"/>
+        <w:sz w:val="20"/>
+      </w:rPr>
+    </w:lvl>
+    <w:lvl w:ilvl="2" w:tentative="1">
+      <w:start w:val="1"/>
+      <w:numFmt w:val="bullet"/>
+      <w:lvlText w:val=""/>
+      <w:lvlJc w:val="left"/>
+      <w:pPr>
+        <w:tabs>
+          <w:tab w:val="num" w:pos="2160"/>
+        </w:tabs>
+        <w:ind w:left="2160" w:hanging="360"/>
+      </w:pPr>
+      <w:rPr>
+        <w:rFonts w:ascii="Wingdings" w:hAnsi="Wingdings" w:hint="default"/>
+        <w:sz w:val="20"/>
+      </w:rPr>
+    </w:lvl>
+    <w:lvl w:ilvl="3" w:tentative="1">
+      <w:start w:val="1"/>
+      <w:numFmt w:val="bullet"/>
+      <w:lvlText w:val=""/>
+      <w:lvlJc w:val="left"/>
+      <w:pPr>
+        <w:tabs>
+          <w:tab w:val="num" w:pos="2880"/>
+        </w:tabs>
+        <w:ind w:left="2880" w:hanging="360"/>
+      </w:pPr>
+      <w:rPr>
+        <w:rFonts w:ascii="Wingdings" w:hAnsi="Wingdings" w:hint="default"/>
+        <w:sz w:val="20"/>
+      </w:rPr>
+    </w:lvl>
+    <w:lvl w:ilvl="4" w:tentative="1">
+      <w:start w:val="1"/>
+      <w:numFmt w:val="bullet"/>
+      <w:lvlText w:val=""/>
+      <w:lvlJc w:val="left"/>
+      <w:pPr>
+        <w:tabs>
+          <w:tab w:val="num" w:pos="3600"/>
+        </w:tabs>
+        <w:ind w:left="3600" w:hanging="360"/>
+      </w:pPr>
+      <w:rPr>
+        <w:rFonts w:ascii="Wingdings" w:hAnsi="Wingdings" w:hint="default"/>
+        <w:sz w:val="20"/>
+      </w:rPr>
+    </w:lvl>
+    <w:lvl w:ilvl="5" w:tentative="1">
+      <w:start w:val="1"/>
+      <w:numFmt w:val="bullet"/>
+      <w:lvlText w:val=""/>
+      <w:lvlJc w:val="left"/>
+      <w:pPr>
+        <w:tabs>
+          <w:tab w:val="num" w:pos="4320"/>
+        </w:tabs>
+        <w:ind w:left="4320" w:hanging="360"/>
+      </w:pPr>
+      <w:rPr>
+        <w:rFonts w:ascii="Wingdings" w:hAnsi="Wingdings" w:hint="default"/>
+        <w:sz w:val="20"/>
+      </w:rPr>
+    </w:lvl>
+    <w:lvl w:ilvl="6" w:tentative="1">
+      <w:start w:val="1"/>
+      <w:numFmt w:val="bullet"/>
+      <w:lvlText w:val=""/>
+      <w:lvlJc w:val="left"/>
+      <w:pPr>
+        <w:tabs>
+          <w:tab w:val="num" w:pos="5040"/>
+        </w:tabs>
+        <w:ind w:left="5040" w:hanging="360"/>
+      </w:pPr>
+      <w:rPr>
+        <w:rFonts w:ascii="Wingdings" w:hAnsi="Wingdings" w:hint="default"/>
+        <w:sz w:val="20"/>
+      </w:rPr>
+    </w:lvl>
+    <w:lvl w:ilvl="7" w:tentative="1">
+      <w:start w:val="1"/>
+      <w:numFmt w:val="bullet"/>
+      <w:lvlText w:val=""/>
+      <w:lvlJc w:val="left"/>
+      <w:pPr>
+        <w:tabs>
+          <w:tab w:val="num" w:pos="5760"/>
+        </w:tabs>
+        <w:ind w:left="5760" w:hanging="360"/>
+      </w:pPr>
+      <w:rPr>
+        <w:rFonts w:ascii="Wingdings" w:hAnsi="Wingdings" w:hint="default"/>
+        <w:sz w:val="20"/>
+      </w:rPr>
+    </w:lvl>
+    <w:lvl w:ilvl="8" w:tentative="1">
+      <w:start w:val="1"/>
+      <w:numFmt w:val="bullet"/>
+      <w:lvlText w:val=""/>
+      <w:lvlJc w:val="left"/>
+      <w:pPr>
+        <w:tabs>
+          <w:tab w:val="num" w:pos="6480"/>
+        </w:tabs>
+        <w:ind w:left="6480" w:hanging="360"/>
+      </w:pPr>
+      <w:rPr>
+        <w:rFonts w:ascii="Wingdings" w:hAnsi="Wingdings" w:hint="default"/>
+        <w:sz w:val="20"/>
+      </w:rPr>
+    </w:lvl>
+  </w:abstractNum>
+  <w:abstractNum w:abstractNumId="35" w15:restartNumberingAfterBreak="0">
+    <w:nsid w:val="534A15DA"/>
+    <w:multiLevelType w:val="hybridMultilevel"/>
+    <w:tmpl w:val="F5F8B3E0"/>
+    <w:lvl w:ilvl="0" w:tplc="40090001">
+      <w:start w:val="1"/>
+      <w:numFmt w:val="bullet"/>
+      <w:lvlText w:val=""/>
+      <w:lvlJc w:val="left"/>
+      <w:pPr>
+        <w:ind w:left="720" w:hanging="360"/>
+      </w:pPr>
+      <w:rPr>
+        <w:rFonts w:ascii="Symbol" w:hAnsi="Symbol" w:hint="default"/>
+      </w:rPr>
+    </w:lvl>
+    <w:lvl w:ilvl="1" w:tplc="40090003" w:tentative="1">
+      <w:start w:val="1"/>
+      <w:numFmt w:val="bullet"/>
+      <w:lvlText w:val="o"/>
+      <w:lvlJc w:val="left"/>
+      <w:pPr>
+        <w:ind w:left="1440" w:hanging="360"/>
+      </w:pPr>
+      <w:rPr>
+        <w:rFonts w:ascii="Courier New" w:hAnsi="Courier New" w:cs="Courier New" w:hint="default"/>
+      </w:rPr>
+    </w:lvl>
+    <w:lvl w:ilvl="2" w:tplc="40090005" w:tentative="1">
+      <w:start w:val="1"/>
+      <w:numFmt w:val="bullet"/>
+      <w:lvlText w:val=""/>
+      <w:lvlJc w:val="left"/>
+      <w:pPr>
+        <w:ind w:left="2160" w:hanging="360"/>
+      </w:pPr>
+      <w:rPr>
+        <w:rFonts w:ascii="Wingdings" w:hAnsi="Wingdings" w:hint="default"/>
+      </w:rPr>
+    </w:lvl>
+    <w:lvl w:ilvl="3" w:tplc="40090001" w:tentative="1">
+      <w:start w:val="1"/>
+      <w:numFmt w:val="bullet"/>
+      <w:lvlText w:val=""/>
+      <w:lvlJc w:val="left"/>
+      <w:pPr>
+        <w:ind w:left="2880" w:hanging="360"/>
+      </w:pPr>
+      <w:rPr>
+        <w:rFonts w:ascii="Symbol" w:hAnsi="Symbol" w:hint="default"/>
+      </w:rPr>
+    </w:lvl>
+    <w:lvl w:ilvl="4" w:tplc="40090003" w:tentative="1">
+      <w:start w:val="1"/>
+      <w:numFmt w:val="bullet"/>
+      <w:lvlText w:val="o"/>
+      <w:lvlJc w:val="left"/>
+      <w:pPr>
+        <w:ind w:left="3600" w:hanging="360"/>
+      </w:pPr>
+      <w:rPr>
+        <w:rFonts w:ascii="Courier New" w:hAnsi="Courier New" w:cs="Courier New" w:hint="default"/>
+      </w:rPr>
+    </w:lvl>
+    <w:lvl w:ilvl="5" w:tplc="40090005" w:tentative="1">
+      <w:start w:val="1"/>
+      <w:numFmt w:val="bullet"/>
+      <w:lvlText w:val=""/>
+      <w:lvlJc w:val="left"/>
+      <w:pPr>
+        <w:ind w:left="4320" w:hanging="360"/>
+      </w:pPr>
+      <w:rPr>
+        <w:rFonts w:ascii="Wingdings" w:hAnsi="Wingdings" w:hint="default"/>
+      </w:rPr>
+    </w:lvl>
+    <w:lvl w:ilvl="6" w:tplc="40090001" w:tentative="1">
+      <w:start w:val="1"/>
+      <w:numFmt w:val="bullet"/>
+      <w:lvlText w:val=""/>
+      <w:lvlJc w:val="left"/>
+      <w:pPr>
+        <w:ind w:left="5040" w:hanging="360"/>
+      </w:pPr>
+      <w:rPr>
+        <w:rFonts w:ascii="Symbol" w:hAnsi="Symbol" w:hint="default"/>
+      </w:rPr>
+    </w:lvl>
+    <w:lvl w:ilvl="7" w:tplc="40090003" w:tentative="1">
+      <w:start w:val="1"/>
+      <w:numFmt w:val="bullet"/>
+      <w:lvlText w:val="o"/>
+      <w:lvlJc w:val="left"/>
+      <w:pPr>
+        <w:ind w:left="5760" w:hanging="360"/>
+      </w:pPr>
+      <w:rPr>
+        <w:rFonts w:ascii="Courier New" w:hAnsi="Courier New" w:cs="Courier New" w:hint="default"/>
+      </w:rPr>
+    </w:lvl>
+    <w:lvl w:ilvl="8" w:tplc="40090005" w:tentative="1">
+      <w:start w:val="1"/>
+      <w:numFmt w:val="bullet"/>
+      <w:lvlText w:val=""/>
+      <w:lvlJc w:val="left"/>
+      <w:pPr>
+        <w:ind w:left="6480" w:hanging="360"/>
+      </w:pPr>
+      <w:rPr>
+        <w:rFonts w:ascii="Wingdings" w:hAnsi="Wingdings" w:hint="default"/>
+      </w:rPr>
+    </w:lvl>
+  </w:abstractNum>
+  <w:abstractNum w:abstractNumId="36" w15:restartNumberingAfterBreak="0">
     <w:nsid w:val="53B3350B"/>
     <w:multiLevelType w:val="hybridMultilevel"/>
     <w:tmpl w:val="3B2C978A"/>
@@ -6288,7 +9645,7 @@
       </w:pPr>
     </w:lvl>
   </w:abstractNum>
-  <w:abstractNum w:abstractNumId="24" w15:restartNumberingAfterBreak="0">
+  <w:abstractNum w:abstractNumId="37" w15:restartNumberingAfterBreak="0">
     <w:nsid w:val="54DF3B82"/>
     <w:multiLevelType w:val="multilevel"/>
     <w:tmpl w:val="CFB4C6C4"/>
@@ -6405,7 +9762,7 @@
       </w:rPr>
     </w:lvl>
   </w:abstractNum>
-  <w:abstractNum w:abstractNumId="25" w15:restartNumberingAfterBreak="0">
+  <w:abstractNum w:abstractNumId="38" w15:restartNumberingAfterBreak="0">
     <w:nsid w:val="565D7615"/>
     <w:multiLevelType w:val="multilevel"/>
     <w:tmpl w:val="C88E9AE4"/>
@@ -6554,7 +9911,156 @@
       </w:rPr>
     </w:lvl>
   </w:abstractNum>
-  <w:abstractNum w:abstractNumId="26" w15:restartNumberingAfterBreak="0">
+  <w:abstractNum w:abstractNumId="39" w15:restartNumberingAfterBreak="0">
+    <w:nsid w:val="5F354CA8"/>
+    <w:multiLevelType w:val="multilevel"/>
+    <w:tmpl w:val="FE56AEE0"/>
+    <w:lvl w:ilvl="0">
+      <w:start w:val="1"/>
+      <w:numFmt w:val="bullet"/>
+      <w:lvlText w:val=""/>
+      <w:lvlJc w:val="left"/>
+      <w:pPr>
+        <w:tabs>
+          <w:tab w:val="num" w:pos="720"/>
+        </w:tabs>
+        <w:ind w:left="720" w:hanging="360"/>
+      </w:pPr>
+      <w:rPr>
+        <w:rFonts w:ascii="Symbol" w:hAnsi="Symbol" w:hint="default"/>
+        <w:sz w:val="20"/>
+      </w:rPr>
+    </w:lvl>
+    <w:lvl w:ilvl="1" w:tentative="1">
+      <w:start w:val="1"/>
+      <w:numFmt w:val="bullet"/>
+      <w:lvlText w:val="o"/>
+      <w:lvlJc w:val="left"/>
+      <w:pPr>
+        <w:tabs>
+          <w:tab w:val="num" w:pos="1440"/>
+        </w:tabs>
+        <w:ind w:left="1440" w:hanging="360"/>
+      </w:pPr>
+      <w:rPr>
+        <w:rFonts w:ascii="Courier New" w:hAnsi="Courier New" w:hint="default"/>
+        <w:sz w:val="20"/>
+      </w:rPr>
+    </w:lvl>
+    <w:lvl w:ilvl="2" w:tentative="1">
+      <w:start w:val="1"/>
+      <w:numFmt w:val="bullet"/>
+      <w:lvlText w:val=""/>
+      <w:lvlJc w:val="left"/>
+      <w:pPr>
+        <w:tabs>
+          <w:tab w:val="num" w:pos="2160"/>
+        </w:tabs>
+        <w:ind w:left="2160" w:hanging="360"/>
+      </w:pPr>
+      <w:rPr>
+        <w:rFonts w:ascii="Wingdings" w:hAnsi="Wingdings" w:hint="default"/>
+        <w:sz w:val="20"/>
+      </w:rPr>
+    </w:lvl>
+    <w:lvl w:ilvl="3" w:tentative="1">
+      <w:start w:val="1"/>
+      <w:numFmt w:val="bullet"/>
+      <w:lvlText w:val=""/>
+      <w:lvlJc w:val="left"/>
+      <w:pPr>
+        <w:tabs>
+          <w:tab w:val="num" w:pos="2880"/>
+        </w:tabs>
+        <w:ind w:left="2880" w:hanging="360"/>
+      </w:pPr>
+      <w:rPr>
+        <w:rFonts w:ascii="Wingdings" w:hAnsi="Wingdings" w:hint="default"/>
+        <w:sz w:val="20"/>
+      </w:rPr>
+    </w:lvl>
+    <w:lvl w:ilvl="4" w:tentative="1">
+      <w:start w:val="1"/>
+      <w:numFmt w:val="bullet"/>
+      <w:lvlText w:val=""/>
+      <w:lvlJc w:val="left"/>
+      <w:pPr>
+        <w:tabs>
+          <w:tab w:val="num" w:pos="3600"/>
+        </w:tabs>
+        <w:ind w:left="3600" w:hanging="360"/>
+      </w:pPr>
+      <w:rPr>
+        <w:rFonts w:ascii="Wingdings" w:hAnsi="Wingdings" w:hint="default"/>
+        <w:sz w:val="20"/>
+      </w:rPr>
+    </w:lvl>
+    <w:lvl w:ilvl="5" w:tentative="1">
+      <w:start w:val="1"/>
+      <w:numFmt w:val="bullet"/>
+      <w:lvlText w:val=""/>
+      <w:lvlJc w:val="left"/>
+      <w:pPr>
+        <w:tabs>
+          <w:tab w:val="num" w:pos="4320"/>
+        </w:tabs>
+        <w:ind w:left="4320" w:hanging="360"/>
+      </w:pPr>
+      <w:rPr>
+        <w:rFonts w:ascii="Wingdings" w:hAnsi="Wingdings" w:hint="default"/>
+        <w:sz w:val="20"/>
+      </w:rPr>
+    </w:lvl>
+    <w:lvl w:ilvl="6" w:tentative="1">
+      <w:start w:val="1"/>
+      <w:numFmt w:val="bullet"/>
+      <w:lvlText w:val=""/>
+      <w:lvlJc w:val="left"/>
+      <w:pPr>
+        <w:tabs>
+          <w:tab w:val="num" w:pos="5040"/>
+        </w:tabs>
+        <w:ind w:left="5040" w:hanging="360"/>
+      </w:pPr>
+      <w:rPr>
+        <w:rFonts w:ascii="Wingdings" w:hAnsi="Wingdings" w:hint="default"/>
+        <w:sz w:val="20"/>
+      </w:rPr>
+    </w:lvl>
+    <w:lvl w:ilvl="7" w:tentative="1">
+      <w:start w:val="1"/>
+      <w:numFmt w:val="bullet"/>
+      <w:lvlText w:val=""/>
+      <w:lvlJc w:val="left"/>
+      <w:pPr>
+        <w:tabs>
+          <w:tab w:val="num" w:pos="5760"/>
+        </w:tabs>
+        <w:ind w:left="5760" w:hanging="360"/>
+      </w:pPr>
+      <w:rPr>
+        <w:rFonts w:ascii="Wingdings" w:hAnsi="Wingdings" w:hint="default"/>
+        <w:sz w:val="20"/>
+      </w:rPr>
+    </w:lvl>
+    <w:lvl w:ilvl="8" w:tentative="1">
+      <w:start w:val="1"/>
+      <w:numFmt w:val="bullet"/>
+      <w:lvlText w:val=""/>
+      <w:lvlJc w:val="left"/>
+      <w:pPr>
+        <w:tabs>
+          <w:tab w:val="num" w:pos="6480"/>
+        </w:tabs>
+        <w:ind w:left="6480" w:hanging="360"/>
+      </w:pPr>
+      <w:rPr>
+        <w:rFonts w:ascii="Wingdings" w:hAnsi="Wingdings" w:hint="default"/>
+        <w:sz w:val="20"/>
+      </w:rPr>
+    </w:lvl>
+  </w:abstractNum>
+  <w:abstractNum w:abstractNumId="40" w15:restartNumberingAfterBreak="0">
     <w:nsid w:val="6762762E"/>
     <w:multiLevelType w:val="hybridMultilevel"/>
     <w:tmpl w:val="8EB2CFE0"/>
@@ -6644,7 +10150,7 @@
       </w:pPr>
     </w:lvl>
   </w:abstractNum>
-  <w:abstractNum w:abstractNumId="27" w15:restartNumberingAfterBreak="0">
+  <w:abstractNum w:abstractNumId="41" w15:restartNumberingAfterBreak="0">
     <w:nsid w:val="6BC64C5D"/>
     <w:multiLevelType w:val="hybridMultilevel"/>
     <w:tmpl w:val="8DA229BA"/>
@@ -6757,7 +10263,7 @@
       </w:rPr>
     </w:lvl>
   </w:abstractNum>
-  <w:abstractNum w:abstractNumId="28" w15:restartNumberingAfterBreak="0">
+  <w:abstractNum w:abstractNumId="42" w15:restartNumberingAfterBreak="0">
     <w:nsid w:val="6C990371"/>
     <w:multiLevelType w:val="hybridMultilevel"/>
     <w:tmpl w:val="7CA440AA"/>
@@ -6870,7 +10376,233 @@
       </w:rPr>
     </w:lvl>
   </w:abstractNum>
-  <w:abstractNum w:abstractNumId="29" w15:restartNumberingAfterBreak="0">
+  <w:abstractNum w:abstractNumId="43" w15:restartNumberingAfterBreak="0">
+    <w:nsid w:val="6F487CAB"/>
+    <w:multiLevelType w:val="hybridMultilevel"/>
+    <w:tmpl w:val="EDD80764"/>
+    <w:lvl w:ilvl="0" w:tplc="40090001">
+      <w:start w:val="1"/>
+      <w:numFmt w:val="bullet"/>
+      <w:lvlText w:val=""/>
+      <w:lvlJc w:val="left"/>
+      <w:pPr>
+        <w:ind w:left="720" w:hanging="360"/>
+      </w:pPr>
+      <w:rPr>
+        <w:rFonts w:ascii="Symbol" w:hAnsi="Symbol" w:hint="default"/>
+      </w:rPr>
+    </w:lvl>
+    <w:lvl w:ilvl="1" w:tplc="40090003" w:tentative="1">
+      <w:start w:val="1"/>
+      <w:numFmt w:val="bullet"/>
+      <w:lvlText w:val="o"/>
+      <w:lvlJc w:val="left"/>
+      <w:pPr>
+        <w:ind w:left="1440" w:hanging="360"/>
+      </w:pPr>
+      <w:rPr>
+        <w:rFonts w:ascii="Courier New" w:hAnsi="Courier New" w:cs="Courier New" w:hint="default"/>
+      </w:rPr>
+    </w:lvl>
+    <w:lvl w:ilvl="2" w:tplc="40090005" w:tentative="1">
+      <w:start w:val="1"/>
+      <w:numFmt w:val="bullet"/>
+      <w:lvlText w:val=""/>
+      <w:lvlJc w:val="left"/>
+      <w:pPr>
+        <w:ind w:left="2160" w:hanging="360"/>
+      </w:pPr>
+      <w:rPr>
+        <w:rFonts w:ascii="Wingdings" w:hAnsi="Wingdings" w:hint="default"/>
+      </w:rPr>
+    </w:lvl>
+    <w:lvl w:ilvl="3" w:tplc="40090001" w:tentative="1">
+      <w:start w:val="1"/>
+      <w:numFmt w:val="bullet"/>
+      <w:lvlText w:val=""/>
+      <w:lvlJc w:val="left"/>
+      <w:pPr>
+        <w:ind w:left="2880" w:hanging="360"/>
+      </w:pPr>
+      <w:rPr>
+        <w:rFonts w:ascii="Symbol" w:hAnsi="Symbol" w:hint="default"/>
+      </w:rPr>
+    </w:lvl>
+    <w:lvl w:ilvl="4" w:tplc="40090003" w:tentative="1">
+      <w:start w:val="1"/>
+      <w:numFmt w:val="bullet"/>
+      <w:lvlText w:val="o"/>
+      <w:lvlJc w:val="left"/>
+      <w:pPr>
+        <w:ind w:left="3600" w:hanging="360"/>
+      </w:pPr>
+      <w:rPr>
+        <w:rFonts w:ascii="Courier New" w:hAnsi="Courier New" w:cs="Courier New" w:hint="default"/>
+      </w:rPr>
+    </w:lvl>
+    <w:lvl w:ilvl="5" w:tplc="40090005" w:tentative="1">
+      <w:start w:val="1"/>
+      <w:numFmt w:val="bullet"/>
+      <w:lvlText w:val=""/>
+      <w:lvlJc w:val="left"/>
+      <w:pPr>
+        <w:ind w:left="4320" w:hanging="360"/>
+      </w:pPr>
+      <w:rPr>
+        <w:rFonts w:ascii="Wingdings" w:hAnsi="Wingdings" w:hint="default"/>
+      </w:rPr>
+    </w:lvl>
+    <w:lvl w:ilvl="6" w:tplc="40090001" w:tentative="1">
+      <w:start w:val="1"/>
+      <w:numFmt w:val="bullet"/>
+      <w:lvlText w:val=""/>
+      <w:lvlJc w:val="left"/>
+      <w:pPr>
+        <w:ind w:left="5040" w:hanging="360"/>
+      </w:pPr>
+      <w:rPr>
+        <w:rFonts w:ascii="Symbol" w:hAnsi="Symbol" w:hint="default"/>
+      </w:rPr>
+    </w:lvl>
+    <w:lvl w:ilvl="7" w:tplc="40090003" w:tentative="1">
+      <w:start w:val="1"/>
+      <w:numFmt w:val="bullet"/>
+      <w:lvlText w:val="o"/>
+      <w:lvlJc w:val="left"/>
+      <w:pPr>
+        <w:ind w:left="5760" w:hanging="360"/>
+      </w:pPr>
+      <w:rPr>
+        <w:rFonts w:ascii="Courier New" w:hAnsi="Courier New" w:cs="Courier New" w:hint="default"/>
+      </w:rPr>
+    </w:lvl>
+    <w:lvl w:ilvl="8" w:tplc="40090005" w:tentative="1">
+      <w:start w:val="1"/>
+      <w:numFmt w:val="bullet"/>
+      <w:lvlText w:val=""/>
+      <w:lvlJc w:val="left"/>
+      <w:pPr>
+        <w:ind w:left="6480" w:hanging="360"/>
+      </w:pPr>
+      <w:rPr>
+        <w:rFonts w:ascii="Wingdings" w:hAnsi="Wingdings" w:hint="default"/>
+      </w:rPr>
+    </w:lvl>
+  </w:abstractNum>
+  <w:abstractNum w:abstractNumId="44" w15:restartNumberingAfterBreak="0">
+    <w:nsid w:val="6FC401E6"/>
+    <w:multiLevelType w:val="hybridMultilevel"/>
+    <w:tmpl w:val="E0AEFD04"/>
+    <w:lvl w:ilvl="0" w:tplc="40090001">
+      <w:start w:val="1"/>
+      <w:numFmt w:val="bullet"/>
+      <w:lvlText w:val=""/>
+      <w:lvlJc w:val="left"/>
+      <w:pPr>
+        <w:ind w:left="720" w:hanging="360"/>
+      </w:pPr>
+      <w:rPr>
+        <w:rFonts w:ascii="Symbol" w:hAnsi="Symbol" w:hint="default"/>
+      </w:rPr>
+    </w:lvl>
+    <w:lvl w:ilvl="1" w:tplc="40090003" w:tentative="1">
+      <w:start w:val="1"/>
+      <w:numFmt w:val="bullet"/>
+      <w:lvlText w:val="o"/>
+      <w:lvlJc w:val="left"/>
+      <w:pPr>
+        <w:ind w:left="1440" w:hanging="360"/>
+      </w:pPr>
+      <w:rPr>
+        <w:rFonts w:ascii="Courier New" w:hAnsi="Courier New" w:cs="Courier New" w:hint="default"/>
+      </w:rPr>
+    </w:lvl>
+    <w:lvl w:ilvl="2" w:tplc="40090005" w:tentative="1">
+      <w:start w:val="1"/>
+      <w:numFmt w:val="bullet"/>
+      <w:lvlText w:val=""/>
+      <w:lvlJc w:val="left"/>
+      <w:pPr>
+        <w:ind w:left="2160" w:hanging="360"/>
+      </w:pPr>
+      <w:rPr>
+        <w:rFonts w:ascii="Wingdings" w:hAnsi="Wingdings" w:hint="default"/>
+      </w:rPr>
+    </w:lvl>
+    <w:lvl w:ilvl="3" w:tplc="40090001" w:tentative="1">
+      <w:start w:val="1"/>
+      <w:numFmt w:val="bullet"/>
+      <w:lvlText w:val=""/>
+      <w:lvlJc w:val="left"/>
+      <w:pPr>
+        <w:ind w:left="2880" w:hanging="360"/>
+      </w:pPr>
+      <w:rPr>
+        <w:rFonts w:ascii="Symbol" w:hAnsi="Symbol" w:hint="default"/>
+      </w:rPr>
+    </w:lvl>
+    <w:lvl w:ilvl="4" w:tplc="40090003" w:tentative="1">
+      <w:start w:val="1"/>
+      <w:numFmt w:val="bullet"/>
+      <w:lvlText w:val="o"/>
+      <w:lvlJc w:val="left"/>
+      <w:pPr>
+        <w:ind w:left="3600" w:hanging="360"/>
+      </w:pPr>
+      <w:rPr>
+        <w:rFonts w:ascii="Courier New" w:hAnsi="Courier New" w:cs="Courier New" w:hint="default"/>
+      </w:rPr>
+    </w:lvl>
+    <w:lvl w:ilvl="5" w:tplc="40090005" w:tentative="1">
+      <w:start w:val="1"/>
+      <w:numFmt w:val="bullet"/>
+      <w:lvlText w:val=""/>
+      <w:lvlJc w:val="left"/>
+      <w:pPr>
+        <w:ind w:left="4320" w:hanging="360"/>
+      </w:pPr>
+      <w:rPr>
+        <w:rFonts w:ascii="Wingdings" w:hAnsi="Wingdings" w:hint="default"/>
+      </w:rPr>
+    </w:lvl>
+    <w:lvl w:ilvl="6" w:tplc="40090001" w:tentative="1">
+      <w:start w:val="1"/>
+      <w:numFmt w:val="bullet"/>
+      <w:lvlText w:val=""/>
+      <w:lvlJc w:val="left"/>
+      <w:pPr>
+        <w:ind w:left="5040" w:hanging="360"/>
+      </w:pPr>
+      <w:rPr>
+        <w:rFonts w:ascii="Symbol" w:hAnsi="Symbol" w:hint="default"/>
+      </w:rPr>
+    </w:lvl>
+    <w:lvl w:ilvl="7" w:tplc="40090003" w:tentative="1">
+      <w:start w:val="1"/>
+      <w:numFmt w:val="bullet"/>
+      <w:lvlText w:val="o"/>
+      <w:lvlJc w:val="left"/>
+      <w:pPr>
+        <w:ind w:left="5760" w:hanging="360"/>
+      </w:pPr>
+      <w:rPr>
+        <w:rFonts w:ascii="Courier New" w:hAnsi="Courier New" w:cs="Courier New" w:hint="default"/>
+      </w:rPr>
+    </w:lvl>
+    <w:lvl w:ilvl="8" w:tplc="40090005" w:tentative="1">
+      <w:start w:val="1"/>
+      <w:numFmt w:val="bullet"/>
+      <w:lvlText w:val=""/>
+      <w:lvlJc w:val="left"/>
+      <w:pPr>
+        <w:ind w:left="6480" w:hanging="360"/>
+      </w:pPr>
+      <w:rPr>
+        <w:rFonts w:ascii="Wingdings" w:hAnsi="Wingdings" w:hint="default"/>
+      </w:rPr>
+    </w:lvl>
+  </w:abstractNum>
+  <w:abstractNum w:abstractNumId="45" w15:restartNumberingAfterBreak="0">
     <w:nsid w:val="6FF4454C"/>
     <w:multiLevelType w:val="hybridMultilevel"/>
     <w:tmpl w:val="949C953A"/>
@@ -6958,7 +10690,7 @@
       </w:pPr>
     </w:lvl>
   </w:abstractNum>
-  <w:abstractNum w:abstractNumId="30" w15:restartNumberingAfterBreak="0">
+  <w:abstractNum w:abstractNumId="46" w15:restartNumberingAfterBreak="0">
     <w:nsid w:val="70856DC2"/>
     <w:multiLevelType w:val="multilevel"/>
     <w:tmpl w:val="CFB4C6C4"/>
@@ -7075,7 +10807,124 @@
       </w:rPr>
     </w:lvl>
   </w:abstractNum>
-  <w:abstractNum w:abstractNumId="31" w15:restartNumberingAfterBreak="0">
+  <w:abstractNum w:abstractNumId="47" w15:restartNumberingAfterBreak="0">
+    <w:nsid w:val="769D2E45"/>
+    <w:multiLevelType w:val="multilevel"/>
+    <w:tmpl w:val="CFB4C6C4"/>
+    <w:lvl w:ilvl="0">
+      <w:start w:val="1"/>
+      <w:numFmt w:val="decimal"/>
+      <w:lvlText w:val="Week %1:"/>
+      <w:lvlJc w:val="left"/>
+      <w:pPr>
+        <w:ind w:left="360" w:hanging="360"/>
+      </w:pPr>
+      <w:rPr>
+        <w:rFonts w:hint="default"/>
+        <w:sz w:val="26"/>
+        <w:szCs w:val="26"/>
+      </w:rPr>
+    </w:lvl>
+    <w:lvl w:ilvl="1">
+      <w:start w:val="1"/>
+      <w:numFmt w:val="lowerLetter"/>
+      <w:lvlText w:val="%2."/>
+      <w:lvlJc w:val="left"/>
+      <w:pPr>
+        <w:ind w:left="720" w:hanging="360"/>
+      </w:pPr>
+      <w:rPr>
+        <w:rFonts w:hint="default"/>
+        <w:sz w:val="20"/>
+        <w:szCs w:val="20"/>
+      </w:rPr>
+    </w:lvl>
+    <w:lvl w:ilvl="2">
+      <w:start w:val="1"/>
+      <w:numFmt w:val="lowerRoman"/>
+      <w:lvlText w:val="%3)"/>
+      <w:lvlJc w:val="left"/>
+      <w:pPr>
+        <w:ind w:left="1080" w:hanging="360"/>
+      </w:pPr>
+      <w:rPr>
+        <w:rFonts w:hint="default"/>
+      </w:rPr>
+    </w:lvl>
+    <w:lvl w:ilvl="3">
+      <w:start w:val="1"/>
+      <w:numFmt w:val="decimal"/>
+      <w:lvlText w:val="(%4)"/>
+      <w:lvlJc w:val="left"/>
+      <w:pPr>
+        <w:ind w:left="1440" w:hanging="360"/>
+      </w:pPr>
+      <w:rPr>
+        <w:rFonts w:hint="default"/>
+      </w:rPr>
+    </w:lvl>
+    <w:lvl w:ilvl="4">
+      <w:start w:val="1"/>
+      <w:numFmt w:val="lowerLetter"/>
+      <w:lvlText w:val="(%5)"/>
+      <w:lvlJc w:val="left"/>
+      <w:pPr>
+        <w:ind w:left="1800" w:hanging="360"/>
+      </w:pPr>
+      <w:rPr>
+        <w:rFonts w:hint="default"/>
+      </w:rPr>
+    </w:lvl>
+    <w:lvl w:ilvl="5">
+      <w:start w:val="1"/>
+      <w:numFmt w:val="lowerRoman"/>
+      <w:lvlText w:val="(%6)"/>
+      <w:lvlJc w:val="left"/>
+      <w:pPr>
+        <w:ind w:left="2160" w:hanging="360"/>
+      </w:pPr>
+      <w:rPr>
+        <w:rFonts w:hint="default"/>
+      </w:rPr>
+    </w:lvl>
+    <w:lvl w:ilvl="6">
+      <w:start w:val="1"/>
+      <w:numFmt w:val="decimal"/>
+      <w:lvlText w:val="%7."/>
+      <w:lvlJc w:val="left"/>
+      <w:pPr>
+        <w:ind w:left="2520" w:hanging="360"/>
+      </w:pPr>
+      <w:rPr>
+        <w:rFonts w:hint="default"/>
+      </w:rPr>
+    </w:lvl>
+    <w:lvl w:ilvl="7">
+      <w:start w:val="1"/>
+      <w:numFmt w:val="lowerLetter"/>
+      <w:lvlText w:val="%8."/>
+      <w:lvlJc w:val="left"/>
+      <w:pPr>
+        <w:ind w:left="2880" w:hanging="360"/>
+      </w:pPr>
+      <w:rPr>
+        <w:rFonts w:hint="default"/>
+      </w:rPr>
+    </w:lvl>
+    <w:lvl w:ilvl="8">
+      <w:start w:val="1"/>
+      <w:numFmt w:val="lowerRoman"/>
+      <w:lvlText w:val="%9."/>
+      <w:lvlJc w:val="left"/>
+      <w:pPr>
+        <w:ind w:left="3240" w:hanging="360"/>
+      </w:pPr>
+      <w:rPr>
+        <w:rFonts w:hint="default"/>
+      </w:rPr>
+    </w:lvl>
+  </w:abstractNum>
+  <w:abstractNum w:abstractNumId="48" w15:restartNumberingAfterBreak="0">
     <w:nsid w:val="7770503F"/>
     <w:multiLevelType w:val="multilevel"/>
     <w:tmpl w:val="8AC63372"/>
@@ -7192,7 +11041,7 @@
       </w:rPr>
     </w:lvl>
   </w:abstractNum>
-  <w:abstractNum w:abstractNumId="32" w15:restartNumberingAfterBreak="0">
+  <w:abstractNum w:abstractNumId="49" w15:restartNumberingAfterBreak="0">
     <w:nsid w:val="7BFC541C"/>
     <w:multiLevelType w:val="hybridMultilevel"/>
     <w:tmpl w:val="1F8EE216"/>
@@ -7305,85 +11154,85 @@
     </w:lvl>
   </w:abstractNum>
   <w:num w:numId="1" w16cid:durableId="374738325">
-    <w:abstractNumId w:val="14"/>
+    <w:abstractNumId w:val="20"/>
   </w:num>
   <w:num w:numId="2" w16cid:durableId="798494441">
-    <w:abstractNumId w:val="8"/>
+    <w:abstractNumId w:val="13"/>
   </w:num>
   <w:num w:numId="3" w16cid:durableId="1792435694">
-    <w:abstractNumId w:val="10"/>
+    <w:abstractNumId w:val="15"/>
   </w:num>
   <w:num w:numId="4" w16cid:durableId="1732386054">
-    <w:abstractNumId w:val="22"/>
+    <w:abstractNumId w:val="33"/>
   </w:num>
   <w:num w:numId="5" w16cid:durableId="1667634934">
-    <w:abstractNumId w:val="7"/>
+    <w:abstractNumId w:val="12"/>
   </w:num>
   <w:num w:numId="6" w16cid:durableId="1381707866">
-    <w:abstractNumId w:val="12"/>
+    <w:abstractNumId w:val="18"/>
   </w:num>
   <w:num w:numId="7" w16cid:durableId="1619750966">
-    <w:abstractNumId w:val="32"/>
+    <w:abstractNumId w:val="49"/>
   </w:num>
   <w:num w:numId="8" w16cid:durableId="69474323">
-    <w:abstractNumId w:val="13"/>
+    <w:abstractNumId w:val="19"/>
   </w:num>
   <w:num w:numId="9" w16cid:durableId="1775049196">
-    <w:abstractNumId w:val="19"/>
+    <w:abstractNumId w:val="29"/>
   </w:num>
   <w:num w:numId="10" w16cid:durableId="311101813">
     <w:abstractNumId w:val="0"/>
   </w:num>
   <w:num w:numId="11" w16cid:durableId="1820537310">
-    <w:abstractNumId w:val="16"/>
+    <w:abstractNumId w:val="24"/>
   </w:num>
   <w:num w:numId="12" w16cid:durableId="1851529975">
-    <w:abstractNumId w:val="9"/>
+    <w:abstractNumId w:val="14"/>
   </w:num>
   <w:num w:numId="13" w16cid:durableId="1497182463">
-    <w:abstractNumId w:val="26"/>
+    <w:abstractNumId w:val="40"/>
   </w:num>
   <w:num w:numId="14" w16cid:durableId="1656452770">
-    <w:abstractNumId w:val="31"/>
+    <w:abstractNumId w:val="48"/>
   </w:num>
   <w:num w:numId="15" w16cid:durableId="451560045">
-    <w:abstractNumId w:val="15"/>
+    <w:abstractNumId w:val="22"/>
   </w:num>
   <w:num w:numId="16" w16cid:durableId="1180895936">
     <w:abstractNumId w:val="4"/>
   </w:num>
   <w:num w:numId="17" w16cid:durableId="1317414891">
-    <w:abstractNumId w:val="18"/>
+    <w:abstractNumId w:val="28"/>
   </w:num>
   <w:num w:numId="18" w16cid:durableId="1266427798">
-    <w:abstractNumId w:val="28"/>
+    <w:abstractNumId w:val="42"/>
   </w:num>
   <w:num w:numId="19" w16cid:durableId="212009486">
-    <w:abstractNumId w:val="29"/>
+    <w:abstractNumId w:val="45"/>
   </w:num>
   <w:num w:numId="20" w16cid:durableId="617025732">
-    <w:abstractNumId w:val="23"/>
+    <w:abstractNumId w:val="36"/>
   </w:num>
   <w:num w:numId="21" w16cid:durableId="378360333">
-    <w:abstractNumId w:val="30"/>
+    <w:abstractNumId w:val="46"/>
   </w:num>
   <w:num w:numId="22" w16cid:durableId="1525248523">
-    <w:abstractNumId w:val="24"/>
+    <w:abstractNumId w:val="37"/>
   </w:num>
   <w:num w:numId="23" w16cid:durableId="843982321">
-    <w:abstractNumId w:val="17"/>
+    <w:abstractNumId w:val="26"/>
   </w:num>
   <w:num w:numId="24" w16cid:durableId="226452696">
     <w:abstractNumId w:val="1"/>
   </w:num>
   <w:num w:numId="25" w16cid:durableId="812454591">
-    <w:abstractNumId w:val="11"/>
+    <w:abstractNumId w:val="17"/>
   </w:num>
   <w:num w:numId="26" w16cid:durableId="1374381555">
-    <w:abstractNumId w:val="21"/>
+    <w:abstractNumId w:val="32"/>
   </w:num>
   <w:num w:numId="27" w16cid:durableId="1205826090">
-    <w:abstractNumId w:val="25"/>
+    <w:abstractNumId w:val="38"/>
   </w:num>
   <w:num w:numId="28" w16cid:durableId="78842053">
     <w:abstractNumId w:val="3"/>
@@ -7392,16 +11241,67 @@
     <w:abstractNumId w:val="5"/>
   </w:num>
   <w:num w:numId="30" w16cid:durableId="474612451">
-    <w:abstractNumId w:val="27"/>
+    <w:abstractNumId w:val="41"/>
   </w:num>
   <w:num w:numId="31" w16cid:durableId="1251738205">
-    <w:abstractNumId w:val="20"/>
+    <w:abstractNumId w:val="30"/>
   </w:num>
   <w:num w:numId="32" w16cid:durableId="320501898">
     <w:abstractNumId w:val="2"/>
   </w:num>
   <w:num w:numId="33" w16cid:durableId="249702139">
+    <w:abstractNumId w:val="8"/>
+  </w:num>
+  <w:num w:numId="34" w16cid:durableId="636647892">
+    <w:abstractNumId w:val="39"/>
+  </w:num>
+  <w:num w:numId="35" w16cid:durableId="1121073286">
+    <w:abstractNumId w:val="11"/>
+  </w:num>
+  <w:num w:numId="36" w16cid:durableId="211574028">
+    <w:abstractNumId w:val="23"/>
+  </w:num>
+  <w:num w:numId="37" w16cid:durableId="313097896">
+    <w:abstractNumId w:val="34"/>
+  </w:num>
+  <w:num w:numId="38" w16cid:durableId="2009138691">
+    <w:abstractNumId w:val="25"/>
+  </w:num>
+  <w:num w:numId="39" w16cid:durableId="965500533">
+    <w:abstractNumId w:val="43"/>
+  </w:num>
+  <w:num w:numId="40" w16cid:durableId="1936746923">
+    <w:abstractNumId w:val="7"/>
+  </w:num>
+  <w:num w:numId="41" w16cid:durableId="835799459">
+    <w:abstractNumId w:val="16"/>
+  </w:num>
+  <w:num w:numId="42" w16cid:durableId="1709645735">
+    <w:abstractNumId w:val="47"/>
+  </w:num>
+  <w:num w:numId="43" w16cid:durableId="1131706935">
+    <w:abstractNumId w:val="35"/>
+  </w:num>
+  <w:num w:numId="44" w16cid:durableId="1775900029">
+    <w:abstractNumId w:val="10"/>
+  </w:num>
+  <w:num w:numId="45" w16cid:durableId="1112364603">
+    <w:abstractNumId w:val="9"/>
+  </w:num>
+  <w:num w:numId="46" w16cid:durableId="1739087581">
     <w:abstractNumId w:val="6"/>
+  </w:num>
+  <w:num w:numId="47" w16cid:durableId="1521972036">
+    <w:abstractNumId w:val="21"/>
+  </w:num>
+  <w:num w:numId="48" w16cid:durableId="1461222417">
+    <w:abstractNumId w:val="44"/>
+  </w:num>
+  <w:num w:numId="49" w16cid:durableId="1352418830">
+    <w:abstractNumId w:val="27"/>
+  </w:num>
+  <w:num w:numId="50" w16cid:durableId="627585519">
+    <w:abstractNumId w:val="31"/>
   </w:num>
 </w:numbering>
 </file>
@@ -8009,6 +11909,7 @@
   <w:style w:type="character" w:default="1" w:styleId="DefaultParagraphFont">
     <w:name w:val="Default Paragraph Font"/>
     <w:uiPriority w:val="1"/>
+    <w:semiHidden/>
     <w:unhideWhenUsed/>
   </w:style>
   <w:style w:type="table" w:default="1" w:styleId="TableNormal">
@@ -8397,6 +12298,83 @@
       <w:u w:val="single"/>
     </w:rPr>
   </w:style>
+  <w:style w:type="paragraph" w:styleId="Header">
+    <w:name w:val="header"/>
+    <w:basedOn w:val="Normal"/>
+    <w:link w:val="HeaderChar"/>
+    <w:uiPriority w:val="99"/>
+    <w:unhideWhenUsed/>
+    <w:rsid w:val="00923FE1"/>
+    <w:pPr>
+      <w:tabs>
+        <w:tab w:val="center" w:pos="4513"/>
+        <w:tab w:val="right" w:pos="9026"/>
+      </w:tabs>
+      <w:spacing w:after="0" w:line="240" w:lineRule="auto"/>
+    </w:pPr>
+  </w:style>
+  <w:style w:type="character" w:customStyle="1" w:styleId="HeaderChar">
+    <w:name w:val="Header Char"/>
+    <w:basedOn w:val="DefaultParagraphFont"/>
+    <w:link w:val="Header"/>
+    <w:uiPriority w:val="99"/>
+    <w:rsid w:val="00923FE1"/>
+  </w:style>
+  <w:style w:type="paragraph" w:styleId="Footer">
+    <w:name w:val="footer"/>
+    <w:basedOn w:val="Normal"/>
+    <w:link w:val="FooterChar"/>
+    <w:uiPriority w:val="99"/>
+    <w:unhideWhenUsed/>
+    <w:rsid w:val="00923FE1"/>
+    <w:pPr>
+      <w:tabs>
+        <w:tab w:val="center" w:pos="4513"/>
+        <w:tab w:val="right" w:pos="9026"/>
+      </w:tabs>
+      <w:spacing w:after="0" w:line="240" w:lineRule="auto"/>
+    </w:pPr>
+  </w:style>
+  <w:style w:type="character" w:customStyle="1" w:styleId="FooterChar">
+    <w:name w:val="Footer Char"/>
+    <w:basedOn w:val="DefaultParagraphFont"/>
+    <w:link w:val="Footer"/>
+    <w:uiPriority w:val="99"/>
+    <w:rsid w:val="00923FE1"/>
+  </w:style>
+  <w:style w:type="paragraph" w:styleId="NoSpacing">
+    <w:name w:val="No Spacing"/>
+    <w:link w:val="NoSpacingChar"/>
+    <w:uiPriority w:val="1"/>
+    <w:qFormat/>
+    <w:rsid w:val="00923FE1"/>
+    <w:pPr>
+      <w:spacing w:after="0" w:line="240" w:lineRule="auto"/>
+    </w:pPr>
+    <w:rPr>
+      <w:rFonts w:eastAsiaTheme="minorEastAsia"/>
+      <w:kern w:val="0"/>
+      <w:sz w:val="22"/>
+      <w:szCs w:val="22"/>
+      <w:lang w:val="en-US"/>
+      <w14:ligatures w14:val="none"/>
+    </w:rPr>
+  </w:style>
+  <w:style w:type="character" w:customStyle="1" w:styleId="NoSpacingChar">
+    <w:name w:val="No Spacing Char"/>
+    <w:basedOn w:val="DefaultParagraphFont"/>
+    <w:link w:val="NoSpacing"/>
+    <w:uiPriority w:val="1"/>
+    <w:rsid w:val="00923FE1"/>
+    <w:rPr>
+      <w:rFonts w:eastAsiaTheme="minorEastAsia"/>
+      <w:kern w:val="0"/>
+      <w:sz w:val="22"/>
+      <w:szCs w:val="22"/>
+      <w:lang w:val="en-US"/>
+      <w14:ligatures w14:val="none"/>
+    </w:rPr>
+  </w:style>
 </w:styles>
 </file>
 

</xml_diff>